<commit_message>
ajout des TP1 et 2
</commit_message>
<xml_diff>
--- a/TP3_EvolInfra.docx
+++ b/TP3_EvolInfra.docx
@@ -130,15 +130,16 @@
         </w:tblCellMar>
       </w:tblPr>
       <w:tblGrid>
-        <w:gridCol w:w="4679"/>
-        <w:gridCol w:w="1561"/>
-        <w:gridCol w:w="3120"/>
+        <w:gridCol w:w="6240"/>
+        <w:gridCol w:w="177"/>
+        <w:gridCol w:w="2943"/>
       </w:tblGrid>
       <w:tr>
         <w:trPr/>
         <w:tc>
           <w:tcPr>
-            <w:tcW w:w="4679" w:type="dxa"/>
+            <w:tcW w:w="6417" w:type="dxa"/>
+            <w:gridSpan w:val="2"/>
             <w:tcBorders>
               <w:top w:val="single" w:sz="2" w:space="0" w:color="000000"/>
               <w:start w:val="single" w:sz="2" w:space="0" w:color="000000"/>
@@ -173,8 +174,7 @@
         </w:tc>
         <w:tc>
           <w:tcPr>
-            <w:tcW w:w="4681" w:type="dxa"/>
-            <w:gridSpan w:val="2"/>
+            <w:tcW w:w="2943" w:type="dxa"/>
             <w:tcBorders>
               <w:top w:val="single" w:sz="2" w:space="0" w:color="000000"/>
               <w:start w:val="single" w:sz="2" w:space="0" w:color="000000"/>
@@ -213,7 +213,6 @@
         <w:tc>
           <w:tcPr>
             <w:tcW w:w="6240" w:type="dxa"/>
-            <w:gridSpan w:val="2"/>
             <w:tcBorders>
               <w:top w:val="single" w:sz="2" w:space="0" w:color="000000"/>
               <w:start w:val="single" w:sz="2" w:space="0" w:color="000000"/>
@@ -258,6 +257,7 @@
         <w:tc>
           <w:tcPr>
             <w:tcW w:w="3120" w:type="dxa"/>
+            <w:gridSpan w:val="2"/>
             <w:tcBorders>
               <w:top w:val="single" w:sz="2" w:space="0" w:color="000000"/>
               <w:start w:val="single" w:sz="2" w:space="0" w:color="000000"/>
@@ -377,7 +377,31 @@
                 <w:szCs w:val="20"/>
                 <w:shd w:fill="auto" w:val="clear"/>
               </w:rPr>
-              <w:t>Date : 2026</w:t>
+              <w:t xml:space="preserve">Date : </w:t>
+            </w:r>
+            <w:r>
+              <w:rPr>
+                <w:rFonts w:eastAsia="Arial" w:cs="Arial"/>
+                <w:b/>
+                <w:bCs/>
+                <w:color w:val="000000"/>
+                <w:sz w:val="20"/>
+                <w:szCs w:val="20"/>
+                <w:shd w:fill="auto" w:val="clear"/>
+              </w:rPr>
+              <w:t>29/04/</w:t>
+            </w:r>
+            <w:r>
+              <w:rPr>
+                <w:rFonts w:eastAsia="Arial" w:cs="Arial"/>
+                <w:b/>
+                <w:bCs/>
+                <w:color w:val="000000"/>
+                <w:sz w:val="20"/>
+                <w:szCs w:val="20"/>
+                <w:shd w:fill="auto" w:val="clear"/>
+              </w:rPr>
+              <w:t>2026</w:t>
             </w:r>
           </w:p>
         </w:tc>
@@ -525,7 +549,27 @@
                 <w:sz w:val="20"/>
                 <w:szCs w:val="20"/>
               </w:rPr>
-              <w:t xml:space="preserve">   Modalité :   Seul(e)</w:t>
+              <w:t xml:space="preserve">   Modalité :   </w:t>
+            </w:r>
+            <w:r>
+              <w:rPr>
+                <w:rFonts w:eastAsia="Arial" w:cs="Arial"/>
+                <w:b w:val="false"/>
+                <w:bCs w:val="false"/>
+                <w:sz w:val="20"/>
+                <w:szCs w:val="20"/>
+              </w:rPr>
+              <w:t>Seul</w:t>
+            </w:r>
+            <w:r>
+              <w:rPr>
+                <w:rFonts w:eastAsia="Arial" w:cs="Arial"/>
+                <w:b w:val="false"/>
+                <w:bCs w:val="false"/>
+                <w:sz w:val="20"/>
+                <w:szCs w:val="20"/>
+              </w:rPr>
+              <w:t>e</w:t>
             </w:r>
             <w:r>
               <w:rPr>
@@ -533,7 +577,7 @@
                 <w:sz w:val="20"/>
                 <w:szCs w:val="20"/>
               </w:rPr>
-              <w:t xml:space="preserve">      En équipe</w:t>
+              <w:t xml:space="preserve">     </w:t>
             </w:r>
           </w:p>
         </w:tc>
@@ -573,7 +617,7 @@
               <w:pStyle w:val="ListParagraph"/>
               <w:numPr>
                 <w:ilvl w:val="0"/>
-                <w:numId w:val="4"/>
+                <w:numId w:val="6"/>
               </w:numPr>
               <w:spacing w:before="0" w:after="40"/>
               <w:rPr/>
@@ -592,7 +636,7 @@
               <w:pStyle w:val="ListParagraph"/>
               <w:numPr>
                 <w:ilvl w:val="0"/>
-                <w:numId w:val="1"/>
+                <w:numId w:val="3"/>
               </w:numPr>
               <w:spacing w:before="0" w:after="40"/>
               <w:rPr/>
@@ -611,7 +655,7 @@
               <w:pStyle w:val="ListParagraph"/>
               <w:numPr>
                 <w:ilvl w:val="0"/>
-                <w:numId w:val="1"/>
+                <w:numId w:val="3"/>
               </w:numPr>
               <w:spacing w:before="0" w:after="40"/>
               <w:rPr/>
@@ -677,7 +721,7 @@
               <w:pStyle w:val="ListParagraph"/>
               <w:numPr>
                 <w:ilvl w:val="0"/>
-                <w:numId w:val="1"/>
+                <w:numId w:val="3"/>
               </w:numPr>
               <w:spacing w:before="0" w:after="40"/>
               <w:rPr/>
@@ -696,7 +740,7 @@
               <w:pStyle w:val="ListParagraph"/>
               <w:numPr>
                 <w:ilvl w:val="0"/>
-                <w:numId w:val="1"/>
+                <w:numId w:val="3"/>
               </w:numPr>
               <w:spacing w:before="0" w:after="40"/>
               <w:rPr/>
@@ -715,7 +759,7 @@
               <w:pStyle w:val="ListParagraph"/>
               <w:numPr>
                 <w:ilvl w:val="0"/>
-                <w:numId w:val="1"/>
+                <w:numId w:val="3"/>
               </w:numPr>
               <w:spacing w:before="0" w:after="40"/>
               <w:rPr/>
@@ -734,7 +778,7 @@
               <w:pStyle w:val="ListParagraph"/>
               <w:numPr>
                 <w:ilvl w:val="0"/>
-                <w:numId w:val="1"/>
+                <w:numId w:val="3"/>
               </w:numPr>
               <w:spacing w:before="0" w:after="40"/>
               <w:rPr/>
@@ -768,7 +812,7 @@
               <w:pStyle w:val="ListParagraph"/>
               <w:numPr>
                 <w:ilvl w:val="0"/>
-                <w:numId w:val="1"/>
+                <w:numId w:val="3"/>
               </w:numPr>
               <w:spacing w:before="0" w:after="40"/>
               <w:rPr/>
@@ -787,7 +831,7 @@
               <w:pStyle w:val="ListParagraph"/>
               <w:numPr>
                 <w:ilvl w:val="0"/>
-                <w:numId w:val="1"/>
+                <w:numId w:val="3"/>
               </w:numPr>
               <w:spacing w:before="0" w:after="40"/>
               <w:rPr/>
@@ -806,7 +850,7 @@
               <w:pStyle w:val="ListParagraph"/>
               <w:numPr>
                 <w:ilvl w:val="0"/>
-                <w:numId w:val="1"/>
+                <w:numId w:val="3"/>
               </w:numPr>
               <w:spacing w:before="0" w:after="40"/>
               <w:rPr/>
@@ -825,7 +869,7 @@
               <w:pStyle w:val="ListParagraph"/>
               <w:numPr>
                 <w:ilvl w:val="0"/>
-                <w:numId w:val="1"/>
+                <w:numId w:val="3"/>
               </w:numPr>
               <w:spacing w:before="0" w:after="40"/>
               <w:rPr/>
@@ -844,7 +888,7 @@
               <w:pStyle w:val="ListParagraph"/>
               <w:numPr>
                 <w:ilvl w:val="0"/>
-                <w:numId w:val="1"/>
+                <w:numId w:val="3"/>
               </w:numPr>
               <w:spacing w:before="0" w:after="40"/>
               <w:rPr/>
@@ -895,7 +939,7 @@
               <w:pStyle w:val="ListParagraph"/>
               <w:numPr>
                 <w:ilvl w:val="0"/>
-                <w:numId w:val="1"/>
+                <w:numId w:val="3"/>
               </w:numPr>
               <w:spacing w:before="0" w:after="40"/>
               <w:rPr/>
@@ -931,7 +975,7 @@
               <w:pStyle w:val="ListParagraph"/>
               <w:numPr>
                 <w:ilvl w:val="0"/>
-                <w:numId w:val="1"/>
+                <w:numId w:val="3"/>
               </w:numPr>
               <w:spacing w:before="0" w:after="40"/>
               <w:rPr/>
@@ -950,7 +994,7 @@
               <w:pStyle w:val="ListParagraph"/>
               <w:numPr>
                 <w:ilvl w:val="0"/>
-                <w:numId w:val="1"/>
+                <w:numId w:val="3"/>
               </w:numPr>
               <w:spacing w:before="0" w:after="40"/>
               <w:rPr>
@@ -973,7 +1017,7 @@
               <w:pStyle w:val="ListParagraph"/>
               <w:numPr>
                 <w:ilvl w:val="0"/>
-                <w:numId w:val="1"/>
+                <w:numId w:val="3"/>
               </w:numPr>
               <w:spacing w:before="0" w:after="40"/>
               <w:rPr>
@@ -1013,7 +1057,7 @@
               <w:pStyle w:val="ListParagraph"/>
               <w:numPr>
                 <w:ilvl w:val="0"/>
-                <w:numId w:val="1"/>
+                <w:numId w:val="3"/>
               </w:numPr>
               <w:spacing w:before="0" w:after="40"/>
               <w:rPr/>
@@ -1032,7 +1076,7 @@
               <w:pStyle w:val="ListParagraph"/>
               <w:numPr>
                 <w:ilvl w:val="0"/>
-                <w:numId w:val="1"/>
+                <w:numId w:val="3"/>
               </w:numPr>
               <w:spacing w:before="0" w:after="40"/>
               <w:rPr/>
@@ -1051,7 +1095,7 @@
               <w:pStyle w:val="ListParagraph"/>
               <w:numPr>
                 <w:ilvl w:val="0"/>
-                <w:numId w:val="1"/>
+                <w:numId w:val="3"/>
               </w:numPr>
               <w:spacing w:before="0" w:after="40"/>
               <w:rPr/>
@@ -1070,7 +1114,7 @@
               <w:pStyle w:val="ListParagraph"/>
               <w:numPr>
                 <w:ilvl w:val="0"/>
-                <w:numId w:val="1"/>
+                <w:numId w:val="3"/>
               </w:numPr>
               <w:spacing w:before="0" w:after="40"/>
               <w:rPr/>
@@ -1089,7 +1133,7 @@
               <w:pStyle w:val="ListParagraph"/>
               <w:numPr>
                 <w:ilvl w:val="0"/>
-                <w:numId w:val="1"/>
+                <w:numId w:val="3"/>
               </w:numPr>
               <w:spacing w:before="0" w:after="40"/>
               <w:rPr/>
@@ -1125,7 +1169,7 @@
               <w:pStyle w:val="ListParagraph"/>
               <w:numPr>
                 <w:ilvl w:val="0"/>
-                <w:numId w:val="1"/>
+                <w:numId w:val="3"/>
               </w:numPr>
               <w:spacing w:before="0" w:after="40"/>
               <w:rPr/>
@@ -1144,7 +1188,7 @@
               <w:pStyle w:val="ListParagraph"/>
               <w:numPr>
                 <w:ilvl w:val="0"/>
-                <w:numId w:val="1"/>
+                <w:numId w:val="3"/>
               </w:numPr>
               <w:spacing w:before="0" w:after="40"/>
               <w:rPr/>
@@ -1163,7 +1207,7 @@
               <w:pStyle w:val="ListParagraph"/>
               <w:numPr>
                 <w:ilvl w:val="0"/>
-                <w:numId w:val="1"/>
+                <w:numId w:val="3"/>
               </w:numPr>
               <w:spacing w:before="0" w:after="40"/>
               <w:rPr/>
@@ -1182,7 +1226,7 @@
               <w:pStyle w:val="ListParagraph"/>
               <w:numPr>
                 <w:ilvl w:val="0"/>
-                <w:numId w:val="1"/>
+                <w:numId w:val="3"/>
               </w:numPr>
               <w:spacing w:before="0" w:after="40"/>
               <w:rPr/>
@@ -1248,7 +1292,7 @@
               <w:pStyle w:val="ListParagraph"/>
               <w:numPr>
                 <w:ilvl w:val="0"/>
-                <w:numId w:val="1"/>
+                <w:numId w:val="3"/>
               </w:numPr>
               <w:spacing w:before="0" w:after="40"/>
               <w:rPr/>
@@ -1267,7 +1311,7 @@
               <w:pStyle w:val="ListParagraph"/>
               <w:numPr>
                 <w:ilvl w:val="0"/>
-                <w:numId w:val="1"/>
+                <w:numId w:val="3"/>
               </w:numPr>
               <w:spacing w:before="0" w:after="40"/>
               <w:rPr/>
@@ -1286,7 +1330,7 @@
               <w:pStyle w:val="ListParagraph"/>
               <w:numPr>
                 <w:ilvl w:val="0"/>
-                <w:numId w:val="1"/>
+                <w:numId w:val="3"/>
               </w:numPr>
               <w:spacing w:before="0" w:after="40"/>
               <w:rPr/>
@@ -1305,7 +1349,7 @@
               <w:pStyle w:val="ListParagraph"/>
               <w:numPr>
                 <w:ilvl w:val="0"/>
-                <w:numId w:val="1"/>
+                <w:numId w:val="3"/>
               </w:numPr>
               <w:spacing w:before="0" w:after="40"/>
               <w:rPr/>
@@ -1341,7 +1385,7 @@
               <w:pStyle w:val="ListParagraph"/>
               <w:numPr>
                 <w:ilvl w:val="0"/>
-                <w:numId w:val="1"/>
+                <w:numId w:val="3"/>
               </w:numPr>
               <w:spacing w:before="0" w:after="40"/>
               <w:rPr/>
@@ -1360,7 +1404,7 @@
               <w:pStyle w:val="ListParagraph"/>
               <w:numPr>
                 <w:ilvl w:val="0"/>
-                <w:numId w:val="1"/>
+                <w:numId w:val="3"/>
               </w:numPr>
               <w:spacing w:before="0" w:after="40"/>
               <w:rPr/>
@@ -1379,7 +1423,7 @@
               <w:pStyle w:val="ListParagraph"/>
               <w:numPr>
                 <w:ilvl w:val="0"/>
-                <w:numId w:val="1"/>
+                <w:numId w:val="3"/>
               </w:numPr>
               <w:spacing w:before="0" w:after="40"/>
               <w:rPr/>
@@ -1398,7 +1442,7 @@
               <w:pStyle w:val="ListParagraph"/>
               <w:numPr>
                 <w:ilvl w:val="0"/>
-                <w:numId w:val="1"/>
+                <w:numId w:val="3"/>
               </w:numPr>
               <w:spacing w:before="0" w:after="40"/>
               <w:rPr/>
@@ -1417,7 +1461,7 @@
               <w:pStyle w:val="ListParagraph"/>
               <w:numPr>
                 <w:ilvl w:val="0"/>
-                <w:numId w:val="1"/>
+                <w:numId w:val="3"/>
               </w:numPr>
               <w:spacing w:before="0" w:after="40"/>
               <w:rPr/>
@@ -1790,7 +1834,7 @@
               <w:pStyle w:val="ListParagraph"/>
               <w:numPr>
                 <w:ilvl w:val="0"/>
-                <w:numId w:val="5"/>
+                <w:numId w:val="7"/>
               </w:numPr>
               <w:spacing w:before="0" w:after="40"/>
               <w:rPr/>
@@ -1811,7 +1855,7 @@
               <w:pStyle w:val="ListParagraph"/>
               <w:numPr>
                 <w:ilvl w:val="0"/>
-                <w:numId w:val="2"/>
+                <w:numId w:val="4"/>
               </w:numPr>
               <w:spacing w:before="0" w:after="40"/>
               <w:rPr/>
@@ -1824,27 +1868,7 @@
                 <w:sz w:val="20"/>
                 <w:szCs w:val="20"/>
               </w:rPr>
-              <w:t xml:space="preserve">Tâche </w:t>
-            </w:r>
-            <w:r>
-              <w:rPr>
-                <w:rFonts w:eastAsia="Arial" w:cs="Arial"/>
-                <w:i/>
-                <w:iCs/>
-                <w:sz w:val="20"/>
-                <w:szCs w:val="20"/>
-              </w:rPr>
-              <w:t>2</w:t>
-            </w:r>
-            <w:r>
-              <w:rPr>
-                <w:rFonts w:eastAsia="Arial" w:cs="Arial"/>
-                <w:i/>
-                <w:iCs/>
-                <w:sz w:val="20"/>
-                <w:szCs w:val="20"/>
-              </w:rPr>
-              <w:t xml:space="preserve"> : Zone Internet</w:t>
+              <w:t>Tâche 2 : Zone Internet</w:t>
             </w:r>
           </w:p>
           <w:p>
@@ -1852,7 +1876,7 @@
               <w:pStyle w:val="ListParagraph"/>
               <w:numPr>
                 <w:ilvl w:val="0"/>
-                <w:numId w:val="2"/>
+                <w:numId w:val="4"/>
               </w:numPr>
               <w:spacing w:before="0" w:after="40"/>
               <w:rPr/>
@@ -1865,27 +1889,7 @@
                 <w:sz w:val="20"/>
                 <w:szCs w:val="20"/>
               </w:rPr>
-              <w:t xml:space="preserve">Tâche </w:t>
-            </w:r>
-            <w:r>
-              <w:rPr>
-                <w:rFonts w:eastAsia="Arial" w:cs="Arial"/>
-                <w:i/>
-                <w:iCs/>
-                <w:sz w:val="20"/>
-                <w:szCs w:val="20"/>
-              </w:rPr>
-              <w:t>3</w:t>
-            </w:r>
-            <w:r>
-              <w:rPr>
-                <w:rFonts w:eastAsia="Arial" w:cs="Arial"/>
-                <w:i/>
-                <w:iCs/>
-                <w:sz w:val="20"/>
-                <w:szCs w:val="20"/>
-              </w:rPr>
-              <w:t xml:space="preserve"> : Serveur NTP</w:t>
+              <w:t>Tâche 3 : Serveur NTP</w:t>
             </w:r>
           </w:p>
           <w:p>
@@ -1893,7 +1897,7 @@
               <w:pStyle w:val="ListParagraph"/>
               <w:numPr>
                 <w:ilvl w:val="0"/>
-                <w:numId w:val="2"/>
+                <w:numId w:val="4"/>
               </w:numPr>
               <w:spacing w:before="0" w:after="40"/>
               <w:rPr/>
@@ -1931,7 +1935,7 @@
               <w:pStyle w:val="ListParagraph"/>
               <w:numPr>
                 <w:ilvl w:val="0"/>
-                <w:numId w:val="2"/>
+                <w:numId w:val="4"/>
               </w:numPr>
               <w:spacing w:before="0" w:after="40"/>
               <w:rPr/>
@@ -1952,7 +1956,7 @@
               <w:pStyle w:val="ListParagraph"/>
               <w:numPr>
                 <w:ilvl w:val="0"/>
-                <w:numId w:val="2"/>
+                <w:numId w:val="4"/>
               </w:numPr>
               <w:spacing w:before="0" w:after="40"/>
               <w:rPr/>
@@ -1973,7 +1977,7 @@
               <w:pStyle w:val="ListParagraph"/>
               <w:numPr>
                 <w:ilvl w:val="0"/>
-                <w:numId w:val="2"/>
+                <w:numId w:val="4"/>
               </w:numPr>
               <w:spacing w:before="0" w:after="40"/>
               <w:rPr/>
@@ -2011,7 +2015,7 @@
               <w:pStyle w:val="ListParagraph"/>
               <w:numPr>
                 <w:ilvl w:val="0"/>
-                <w:numId w:val="2"/>
+                <w:numId w:val="4"/>
               </w:numPr>
               <w:spacing w:before="0" w:after="40"/>
               <w:rPr/>
@@ -2032,7 +2036,7 @@
               <w:pStyle w:val="ListParagraph"/>
               <w:numPr>
                 <w:ilvl w:val="0"/>
-                <w:numId w:val="2"/>
+                <w:numId w:val="4"/>
               </w:numPr>
               <w:spacing w:before="0" w:after="40"/>
               <w:rPr/>
@@ -2053,7 +2057,7 @@
               <w:pStyle w:val="ListParagraph"/>
               <w:numPr>
                 <w:ilvl w:val="0"/>
-                <w:numId w:val="2"/>
+                <w:numId w:val="4"/>
               </w:numPr>
               <w:spacing w:before="0" w:after="40"/>
               <w:rPr/>
@@ -2074,7 +2078,7 @@
               <w:pStyle w:val="ListParagraph"/>
               <w:numPr>
                 <w:ilvl w:val="0"/>
-                <w:numId w:val="2"/>
+                <w:numId w:val="4"/>
               </w:numPr>
               <w:spacing w:before="0" w:after="40"/>
               <w:rPr/>
@@ -2112,7 +2116,7 @@
               <w:pStyle w:val="ListParagraph"/>
               <w:numPr>
                 <w:ilvl w:val="0"/>
-                <w:numId w:val="2"/>
+                <w:numId w:val="4"/>
               </w:numPr>
               <w:spacing w:before="0" w:after="40"/>
               <w:rPr/>
@@ -2133,7 +2137,7 @@
               <w:pStyle w:val="ListParagraph"/>
               <w:numPr>
                 <w:ilvl w:val="0"/>
-                <w:numId w:val="2"/>
+                <w:numId w:val="4"/>
               </w:numPr>
               <w:spacing w:before="0" w:after="40"/>
               <w:rPr/>
@@ -2154,7 +2158,7 @@
               <w:pStyle w:val="ListParagraph"/>
               <w:numPr>
                 <w:ilvl w:val="0"/>
-                <w:numId w:val="2"/>
+                <w:numId w:val="4"/>
               </w:numPr>
               <w:spacing w:before="0" w:after="40"/>
               <w:rPr/>
@@ -2209,7 +2213,7 @@
               <w:pStyle w:val="ListParagraph"/>
               <w:numPr>
                 <w:ilvl w:val="0"/>
-                <w:numId w:val="2"/>
+                <w:numId w:val="4"/>
               </w:numPr>
               <w:spacing w:before="0" w:after="40"/>
               <w:rPr/>
@@ -2230,7 +2234,7 @@
               <w:pStyle w:val="ListParagraph"/>
               <w:numPr>
                 <w:ilvl w:val="0"/>
-                <w:numId w:val="2"/>
+                <w:numId w:val="4"/>
               </w:numPr>
               <w:spacing w:before="0" w:after="40"/>
               <w:rPr/>
@@ -2251,7 +2255,7 @@
               <w:pStyle w:val="ListParagraph"/>
               <w:numPr>
                 <w:ilvl w:val="0"/>
-                <w:numId w:val="2"/>
+                <w:numId w:val="4"/>
               </w:numPr>
               <w:spacing w:before="0" w:after="40"/>
               <w:rPr/>
@@ -2289,7 +2293,7 @@
               <w:pStyle w:val="ListParagraph"/>
               <w:numPr>
                 <w:ilvl w:val="0"/>
-                <w:numId w:val="2"/>
+                <w:numId w:val="4"/>
               </w:numPr>
               <w:spacing w:before="0" w:after="40"/>
               <w:rPr/>
@@ -2310,7 +2314,7 @@
               <w:pStyle w:val="ListParagraph"/>
               <w:numPr>
                 <w:ilvl w:val="0"/>
-                <w:numId w:val="2"/>
+                <w:numId w:val="4"/>
               </w:numPr>
               <w:spacing w:before="0" w:after="40"/>
               <w:rPr/>
@@ -2348,7 +2352,7 @@
               <w:pStyle w:val="ListParagraph"/>
               <w:numPr>
                 <w:ilvl w:val="0"/>
-                <w:numId w:val="2"/>
+                <w:numId w:val="4"/>
               </w:numPr>
               <w:spacing w:before="0" w:after="40"/>
               <w:rPr/>
@@ -2369,7 +2373,7 @@
               <w:pStyle w:val="ListParagraph"/>
               <w:numPr>
                 <w:ilvl w:val="0"/>
-                <w:numId w:val="2"/>
+                <w:numId w:val="4"/>
               </w:numPr>
               <w:spacing w:before="0" w:after="40"/>
               <w:rPr/>
@@ -2407,7 +2411,7 @@
               <w:pStyle w:val="ListParagraph"/>
               <w:numPr>
                 <w:ilvl w:val="0"/>
-                <w:numId w:val="2"/>
+                <w:numId w:val="4"/>
               </w:numPr>
               <w:spacing w:before="0" w:after="40"/>
               <w:rPr/>
@@ -2428,7 +2432,7 @@
               <w:pStyle w:val="ListParagraph"/>
               <w:numPr>
                 <w:ilvl w:val="0"/>
-                <w:numId w:val="2"/>
+                <w:numId w:val="4"/>
               </w:numPr>
               <w:spacing w:before="0" w:after="40"/>
               <w:rPr/>
@@ -2539,7 +2543,7 @@
         <w:pStyle w:val="ListParagraph"/>
         <w:numPr>
           <w:ilvl w:val="0"/>
-          <w:numId w:val="1"/>
+          <w:numId w:val="3"/>
         </w:numPr>
         <w:spacing w:before="0" w:after="40"/>
         <w:rPr/>
@@ -2558,7 +2562,7 @@
         <w:pStyle w:val="ListParagraph"/>
         <w:numPr>
           <w:ilvl w:val="0"/>
-          <w:numId w:val="1"/>
+          <w:numId w:val="3"/>
         </w:numPr>
         <w:spacing w:before="0" w:after="40"/>
         <w:rPr/>
@@ -2577,7 +2581,7 @@
         <w:pStyle w:val="ListParagraph"/>
         <w:numPr>
           <w:ilvl w:val="0"/>
-          <w:numId w:val="1"/>
+          <w:numId w:val="3"/>
         </w:numPr>
         <w:spacing w:before="0" w:after="40"/>
         <w:rPr/>
@@ -2596,7 +2600,7 @@
         <w:pStyle w:val="ListParagraph"/>
         <w:numPr>
           <w:ilvl w:val="0"/>
-          <w:numId w:val="1"/>
+          <w:numId w:val="3"/>
         </w:numPr>
         <w:spacing w:before="0" w:after="40"/>
         <w:rPr/>
@@ -2674,7 +2678,7 @@
         <w:pStyle w:val="ListParagraph"/>
         <w:numPr>
           <w:ilvl w:val="0"/>
-          <w:numId w:val="1"/>
+          <w:numId w:val="3"/>
         </w:numPr>
         <w:spacing w:before="0" w:after="40"/>
         <w:rPr/>
@@ -2693,7 +2697,7 @@
         <w:pStyle w:val="ListParagraph"/>
         <w:numPr>
           <w:ilvl w:val="0"/>
-          <w:numId w:val="1"/>
+          <w:numId w:val="3"/>
         </w:numPr>
         <w:spacing w:before="0" w:after="40"/>
         <w:rPr/>
@@ -2712,7 +2716,7 @@
         <w:pStyle w:val="ListParagraph"/>
         <w:numPr>
           <w:ilvl w:val="0"/>
-          <w:numId w:val="1"/>
+          <w:numId w:val="3"/>
         </w:numPr>
         <w:spacing w:before="0" w:after="40"/>
         <w:rPr/>
@@ -2731,7 +2735,7 @@
         <w:pStyle w:val="ListParagraph"/>
         <w:numPr>
           <w:ilvl w:val="0"/>
-          <w:numId w:val="1"/>
+          <w:numId w:val="3"/>
         </w:numPr>
         <w:spacing w:before="0" w:after="40"/>
         <w:rPr/>
@@ -2767,7 +2771,7 @@
         <w:pStyle w:val="ListParagraph"/>
         <w:numPr>
           <w:ilvl w:val="0"/>
-          <w:numId w:val="1"/>
+          <w:numId w:val="3"/>
         </w:numPr>
         <w:spacing w:before="0" w:after="40"/>
         <w:rPr/>
@@ -2786,7 +2790,7 @@
         <w:pStyle w:val="ListParagraph"/>
         <w:numPr>
           <w:ilvl w:val="0"/>
-          <w:numId w:val="1"/>
+          <w:numId w:val="3"/>
         </w:numPr>
         <w:spacing w:before="0" w:after="40"/>
         <w:rPr/>
@@ -2805,7 +2809,7 @@
         <w:pStyle w:val="ListParagraph"/>
         <w:numPr>
           <w:ilvl w:val="0"/>
-          <w:numId w:val="1"/>
+          <w:numId w:val="3"/>
         </w:numPr>
         <w:spacing w:before="0" w:after="40"/>
         <w:rPr/>
@@ -2824,7 +2828,7 @@
         <w:pStyle w:val="ListParagraph"/>
         <w:numPr>
           <w:ilvl w:val="0"/>
-          <w:numId w:val="1"/>
+          <w:numId w:val="3"/>
         </w:numPr>
         <w:spacing w:before="0" w:after="40"/>
         <w:rPr/>
@@ -2843,7 +2847,7 @@
         <w:pStyle w:val="ListParagraph"/>
         <w:numPr>
           <w:ilvl w:val="0"/>
-          <w:numId w:val="1"/>
+          <w:numId w:val="3"/>
         </w:numPr>
         <w:spacing w:before="0" w:after="40"/>
         <w:rPr/>
@@ -3288,7 +3292,7 @@
       </w:pPr>
       <w:r>
         <w:drawing>
-          <wp:anchor distT="0" distB="0" distL="0" distR="0" simplePos="0" relativeHeight="2" behindDoc="0" locked="0" layoutInCell="0" allowOverlap="1">
+          <wp:anchor distT="0" distB="0" distL="0" distR="0" simplePos="0" relativeHeight="4" behindDoc="0" locked="0" layoutInCell="0" allowOverlap="1">
             <wp:simplePos x="0" y="0"/>
             <wp:positionH relativeFrom="column">
               <wp:posOffset>247650</wp:posOffset>
@@ -3939,7 +3943,7 @@
           <w:szCs w:val="20"/>
         </w:rPr>
         <w:drawing>
-          <wp:anchor distT="0" distB="0" distL="0" distR="0" simplePos="0" relativeHeight="6" behindDoc="0" locked="0" layoutInCell="0" allowOverlap="1">
+          <wp:anchor distT="0" distB="0" distL="0" distR="0" simplePos="0" relativeHeight="8" behindDoc="0" locked="0" layoutInCell="0" allowOverlap="1">
             <wp:simplePos x="0" y="0"/>
             <wp:positionH relativeFrom="column">
               <wp:posOffset>-19050</wp:posOffset>
@@ -4273,7 +4277,7 @@
           <w:szCs w:val="22"/>
         </w:rPr>
         <w:drawing>
-          <wp:anchor distT="0" distB="0" distL="0" distR="0" simplePos="0" relativeHeight="5" behindDoc="0" locked="0" layoutInCell="0" allowOverlap="1">
+          <wp:anchor distT="0" distB="0" distL="0" distR="0" simplePos="0" relativeHeight="7" behindDoc="0" locked="0" layoutInCell="0" allowOverlap="1">
             <wp:simplePos x="0" y="0"/>
             <wp:positionH relativeFrom="column">
               <wp:posOffset>-66040</wp:posOffset>
@@ -4763,7 +4767,7 @@
       <w:r>
         <w:rPr/>
         <w:drawing>
-          <wp:anchor distT="0" distB="0" distL="0" distR="0" simplePos="0" relativeHeight="3" behindDoc="0" locked="0" layoutInCell="0" allowOverlap="1">
+          <wp:anchor distT="0" distB="0" distL="0" distR="0" simplePos="0" relativeHeight="5" behindDoc="0" locked="0" layoutInCell="0" allowOverlap="1">
             <wp:simplePos x="0" y="0"/>
             <wp:positionH relativeFrom="column">
               <wp:posOffset>11430</wp:posOffset>
@@ -5032,7 +5036,7 @@
         <w:pStyle w:val="ListParagraph"/>
         <w:numPr>
           <w:ilvl w:val="0"/>
-          <w:numId w:val="1"/>
+          <w:numId w:val="3"/>
         </w:numPr>
         <w:spacing w:before="0" w:after="40"/>
         <w:rPr/>
@@ -5051,7 +5055,7 @@
         <w:pStyle w:val="ListParagraph"/>
         <w:numPr>
           <w:ilvl w:val="0"/>
-          <w:numId w:val="1"/>
+          <w:numId w:val="3"/>
         </w:numPr>
         <w:spacing w:before="0" w:after="40"/>
         <w:rPr>
@@ -5086,7 +5090,7 @@
           <w:szCs w:val="20"/>
         </w:rPr>
         <w:drawing>
-          <wp:anchor distT="0" distB="0" distL="0" distR="0" simplePos="0" relativeHeight="4" behindDoc="0" locked="0" layoutInCell="0" allowOverlap="1">
+          <wp:anchor distT="0" distB="0" distL="0" distR="0" simplePos="0" relativeHeight="6" behindDoc="0" locked="0" layoutInCell="0" allowOverlap="1">
             <wp:simplePos x="0" y="0"/>
             <wp:positionH relativeFrom="column">
               <wp:posOffset>443865</wp:posOffset>
@@ -5384,7 +5388,7 @@
           <w:szCs w:val="20"/>
         </w:rPr>
         <w:drawing>
-          <wp:anchor distT="0" distB="0" distL="0" distR="0" simplePos="0" relativeHeight="13" behindDoc="0" locked="0" layoutInCell="0" allowOverlap="1">
+          <wp:anchor distT="0" distB="0" distL="0" distR="0" simplePos="0" relativeHeight="15" behindDoc="0" locked="0" layoutInCell="0" allowOverlap="1">
             <wp:simplePos x="0" y="0"/>
             <wp:positionH relativeFrom="column">
               <wp:posOffset>-64770</wp:posOffset>
@@ -5556,7 +5560,7 @@
           <w:szCs w:val="20"/>
         </w:rPr>
         <w:drawing>
-          <wp:anchor distT="0" distB="0" distL="0" distR="0" simplePos="0" relativeHeight="12" behindDoc="0" locked="0" layoutInCell="0" allowOverlap="1">
+          <wp:anchor distT="0" distB="0" distL="0" distR="0" simplePos="0" relativeHeight="14" behindDoc="0" locked="0" layoutInCell="0" allowOverlap="1">
             <wp:simplePos x="0" y="0"/>
             <wp:positionH relativeFrom="column">
               <wp:posOffset>-110490</wp:posOffset>
@@ -5814,7 +5818,11 @@
         </w:rPr>
       </w:pPr>
       <w:r>
-        <w:rPr/>
+        <w:rPr>
+          <w:rFonts w:eastAsia="Arial" w:cs="Arial"/>
+          <w:sz w:val="20"/>
+          <w:szCs w:val="20"/>
+        </w:rPr>
       </w:r>
     </w:p>
     <w:p>
@@ -5831,27 +5839,7 @@
           <w:sz w:val="22"/>
           <w:szCs w:val="22"/>
         </w:rPr>
-        <w:t xml:space="preserve">Tâche </w:t>
-      </w:r>
-      <w:r>
-        <w:rPr>
-          <w:rFonts w:eastAsia="Arial" w:cs="Arial"/>
-          <w:b/>
-          <w:bCs/>
-          <w:sz w:val="22"/>
-          <w:szCs w:val="22"/>
-        </w:rPr>
-        <w:t>3</w:t>
-      </w:r>
-      <w:r>
-        <w:rPr>
-          <w:rFonts w:eastAsia="Arial" w:cs="Arial"/>
-          <w:b/>
-          <w:bCs/>
-          <w:sz w:val="22"/>
-          <w:szCs w:val="22"/>
-        </w:rPr>
-        <w:t xml:space="preserve"> : Serveur NTP</w:t>
+        <w:t>Tâche 3 : Serveur NTP</w:t>
       </w:r>
     </w:p>
     <w:p>
@@ -5890,7 +5878,7 @@
           <w:szCs w:val="20"/>
         </w:rPr>
         <w:drawing>
-          <wp:anchor distT="0" distB="0" distL="0" distR="0" simplePos="0" relativeHeight="7" behindDoc="0" locked="0" layoutInCell="0" allowOverlap="1">
+          <wp:anchor distT="0" distB="0" distL="0" distR="0" simplePos="0" relativeHeight="9" behindDoc="0" locked="0" layoutInCell="0" allowOverlap="1">
             <wp:simplePos x="0" y="0"/>
             <wp:positionH relativeFrom="column">
               <wp:posOffset>43815</wp:posOffset>
@@ -6414,7 +6402,7 @@
           <w:szCs w:val="20"/>
         </w:rPr>
         <w:drawing>
-          <wp:anchor distT="0" distB="0" distL="0" distR="0" simplePos="0" relativeHeight="8" behindDoc="0" locked="0" layoutInCell="0" allowOverlap="1">
+          <wp:anchor distT="0" distB="0" distL="0" distR="0" simplePos="0" relativeHeight="10" behindDoc="0" locked="0" layoutInCell="0" allowOverlap="1">
             <wp:simplePos x="0" y="0"/>
             <wp:positionH relativeFrom="column">
               <wp:posOffset>45720</wp:posOffset>
@@ -6881,7 +6869,7 @@
       <w:r>
         <w:rPr/>
         <w:drawing>
-          <wp:anchor distT="0" distB="0" distL="0" distR="0" simplePos="0" relativeHeight="9" behindDoc="0" locked="0" layoutInCell="0" allowOverlap="1">
+          <wp:anchor distT="0" distB="0" distL="0" distR="0" simplePos="0" relativeHeight="11" behindDoc="0" locked="0" layoutInCell="0" allowOverlap="1">
             <wp:simplePos x="0" y="0"/>
             <wp:positionH relativeFrom="column">
               <wp:posOffset>-30480</wp:posOffset>
@@ -7257,7 +7245,7 @@
           <w:szCs w:val="22"/>
         </w:rPr>
         <w:drawing>
-          <wp:anchor distT="0" distB="0" distL="0" distR="0" simplePos="0" relativeHeight="10" behindDoc="0" locked="0" layoutInCell="0" allowOverlap="1">
+          <wp:anchor distT="0" distB="0" distL="0" distR="0" simplePos="0" relativeHeight="12" behindDoc="0" locked="0" layoutInCell="0" allowOverlap="1">
             <wp:simplePos x="0" y="0"/>
             <wp:positionH relativeFrom="column">
               <wp:posOffset>72390</wp:posOffset>
@@ -7347,7 +7335,7 @@
           <w:szCs w:val="22"/>
         </w:rPr>
         <w:drawing>
-          <wp:anchor distT="0" distB="0" distL="0" distR="0" simplePos="0" relativeHeight="11" behindDoc="0" locked="0" layoutInCell="0" allowOverlap="1">
+          <wp:anchor distT="0" distB="0" distL="0" distR="0" simplePos="0" relativeHeight="13" behindDoc="0" locked="0" layoutInCell="0" allowOverlap="1">
             <wp:simplePos x="0" y="0"/>
             <wp:positionH relativeFrom="column">
               <wp:posOffset>-34290</wp:posOffset>
@@ -7922,7 +7910,7 @@
         <w:pStyle w:val="ListParagraph"/>
         <w:numPr>
           <w:ilvl w:val="0"/>
-          <w:numId w:val="1"/>
+          <w:numId w:val="3"/>
         </w:numPr>
         <w:spacing w:before="0" w:after="40"/>
         <w:rPr/>
@@ -7941,7 +7929,7 @@
         <w:pStyle w:val="ListParagraph"/>
         <w:numPr>
           <w:ilvl w:val="0"/>
-          <w:numId w:val="1"/>
+          <w:numId w:val="3"/>
         </w:numPr>
         <w:spacing w:before="0" w:after="40"/>
         <w:rPr/>
@@ -7960,7 +7948,7 @@
         <w:pStyle w:val="ListParagraph"/>
         <w:numPr>
           <w:ilvl w:val="0"/>
-          <w:numId w:val="1"/>
+          <w:numId w:val="3"/>
         </w:numPr>
         <w:spacing w:before="0" w:after="40"/>
         <w:rPr/>
@@ -8017,7 +8005,7 @@
           <w:szCs w:val="20"/>
         </w:rPr>
         <w:drawing>
-          <wp:anchor distT="0" distB="0" distL="0" distR="0" simplePos="0" relativeHeight="14" behindDoc="0" locked="0" layoutInCell="0" allowOverlap="1">
+          <wp:anchor distT="0" distB="0" distL="0" distR="0" simplePos="0" relativeHeight="16" behindDoc="0" locked="0" layoutInCell="0" allowOverlap="1">
             <wp:simplePos x="0" y="0"/>
             <wp:positionH relativeFrom="column">
               <wp:posOffset>191135</wp:posOffset>
@@ -8239,7 +8227,7 @@
           <w:szCs w:val="20"/>
         </w:rPr>
         <w:drawing>
-          <wp:anchor distT="0" distB="0" distL="0" distR="0" simplePos="0" relativeHeight="15" behindDoc="0" locked="0" layoutInCell="0" allowOverlap="1">
+          <wp:anchor distT="0" distB="0" distL="0" distR="0" simplePos="0" relativeHeight="17" behindDoc="0" locked="0" layoutInCell="0" allowOverlap="1">
             <wp:simplePos x="0" y="0"/>
             <wp:positionH relativeFrom="column">
               <wp:posOffset>236855</wp:posOffset>
@@ -8760,7 +8748,7 @@
           <w:szCs w:val="20"/>
         </w:rPr>
         <w:drawing>
-          <wp:anchor distT="0" distB="0" distL="0" distR="0" simplePos="0" relativeHeight="16" behindDoc="0" locked="0" layoutInCell="0" allowOverlap="1">
+          <wp:anchor distT="0" distB="0" distL="0" distR="0" simplePos="0" relativeHeight="18" behindDoc="0" locked="0" layoutInCell="0" allowOverlap="1">
             <wp:simplePos x="0" y="0"/>
             <wp:positionH relativeFrom="column">
               <wp:posOffset>48260</wp:posOffset>
@@ -9204,15 +9192,8 @@
         </w:rPr>
       </w:pPr>
       <w:r>
-        <w:rPr>
-          <w:rFonts w:eastAsia="Arial" w:cs="Arial"/>
-          <w:b/>
-          <w:bCs/>
-          <w:sz w:val="22"/>
-          <w:szCs w:val="22"/>
-        </w:rPr>
         <w:drawing>
-          <wp:anchor distT="0" distB="0" distL="0" distR="0" simplePos="0" relativeHeight="17" behindDoc="0" locked="0" layoutInCell="0" allowOverlap="1">
+          <wp:anchor distT="0" distB="0" distL="0" distR="0" simplePos="0" relativeHeight="19" behindDoc="0" locked="0" layoutInCell="0" allowOverlap="1">
             <wp:simplePos x="0" y="0"/>
             <wp:positionH relativeFrom="column">
               <wp:posOffset>772160</wp:posOffset>
@@ -9578,7 +9559,7 @@
         <w:pStyle w:val="ListParagraph"/>
         <w:numPr>
           <w:ilvl w:val="0"/>
-          <w:numId w:val="1"/>
+          <w:numId w:val="3"/>
         </w:numPr>
         <w:spacing w:before="0" w:after="40"/>
         <w:rPr>
@@ -9797,7 +9778,7 @@
           <w:szCs w:val="20"/>
         </w:rPr>
         <w:drawing>
-          <wp:anchor distT="0" distB="0" distL="0" distR="0" simplePos="0" relativeHeight="19" behindDoc="0" locked="0" layoutInCell="0" allowOverlap="1">
+          <wp:anchor distT="0" distB="0" distL="0" distR="0" simplePos="0" relativeHeight="21" behindDoc="0" locked="0" layoutInCell="0" allowOverlap="1">
             <wp:simplePos x="0" y="0"/>
             <wp:positionH relativeFrom="column">
               <wp:posOffset>-293370</wp:posOffset>
@@ -10680,7 +10661,7 @@
           <w:szCs w:val="22"/>
         </w:rPr>
         <w:drawing>
-          <wp:anchor distT="0" distB="0" distL="0" distR="0" simplePos="0" relativeHeight="18" behindDoc="0" locked="0" layoutInCell="0" allowOverlap="1">
+          <wp:anchor distT="0" distB="0" distL="0" distR="0" simplePos="0" relativeHeight="20" behindDoc="0" locked="0" layoutInCell="0" allowOverlap="1">
             <wp:simplePos x="0" y="0"/>
             <wp:positionH relativeFrom="column">
               <wp:posOffset>165735</wp:posOffset>
@@ -11663,7 +11644,7 @@
           <w:szCs w:val="20"/>
         </w:rPr>
         <w:drawing>
-          <wp:anchor distT="0" distB="0" distL="0" distR="0" simplePos="0" relativeHeight="20" behindDoc="0" locked="0" layoutInCell="0" allowOverlap="1">
+          <wp:anchor distT="0" distB="0" distL="0" distR="0" simplePos="0" relativeHeight="22" behindDoc="0" locked="0" layoutInCell="0" allowOverlap="1">
             <wp:simplePos x="0" y="0"/>
             <wp:positionH relativeFrom="column">
               <wp:align>center</wp:align>
@@ -12067,7 +12048,7 @@
       <w:r>
         <w:rPr/>
         <w:drawing>
-          <wp:anchor distT="0" distB="0" distL="0" distR="0" simplePos="0" relativeHeight="21" behindDoc="0" locked="0" layoutInCell="0" allowOverlap="1">
+          <wp:anchor distT="0" distB="0" distL="0" distR="0" simplePos="0" relativeHeight="23" behindDoc="0" locked="0" layoutInCell="0" allowOverlap="1">
             <wp:simplePos x="0" y="0"/>
             <wp:positionH relativeFrom="column">
               <wp:posOffset>144780</wp:posOffset>
@@ -12127,7 +12108,13 @@
         </w:rPr>
       </w:pPr>
       <w:r>
-        <w:rPr/>
+        <w:rPr>
+          <w:rFonts w:eastAsia="Arial" w:cs="Arial"/>
+          <w:i/>
+          <w:iCs/>
+          <w:sz w:val="20"/>
+          <w:szCs w:val="20"/>
+        </w:rPr>
       </w:r>
     </w:p>
     <w:p>
@@ -12277,21 +12264,7 @@
       <w:bookmarkStart w:id="0" w:name="docs-internal-guid-7d714231-7fff-f719-a4"/>
       <w:bookmarkEnd w:id="0"/>
       <w:r>
-        <w:rPr>
-          <w:rFonts w:eastAsia="Arial" w:cs="Arial"/>
-          <w:b/>
-          <w:bCs/>
-          <w:caps w:val="false"/>
-          <w:smallCaps w:val="false"/>
-          <w:strike w:val="false"/>
-          <w:dstrike w:val="false"/>
-          <w:color w:val="000000"/>
-          <w:sz w:val="22"/>
-          <w:szCs w:val="22"/>
-          <w:u w:val="none"/>
-          <w:effect w:val="none"/>
-          <w:shd w:fill="auto" w:val="clear"/>
-        </w:rPr>
+        <w:rPr/>
         <w:drawing>
           <wp:inline distT="0" distB="0" distL="0" distR="0">
             <wp:extent cx="3615690" cy="2423160"/>
@@ -12488,7 +12461,7 @@
         <w:pStyle w:val="ListParagraph"/>
         <w:numPr>
           <w:ilvl w:val="0"/>
-          <w:numId w:val="1"/>
+          <w:numId w:val="3"/>
         </w:numPr>
         <w:spacing w:before="0" w:after="40"/>
         <w:rPr/>
@@ -12751,7 +12724,7 @@
         <w:pStyle w:val="ListParagraph"/>
         <w:numPr>
           <w:ilvl w:val="0"/>
-          <w:numId w:val="1"/>
+          <w:numId w:val="3"/>
         </w:numPr>
         <w:spacing w:before="0" w:after="40"/>
         <w:rPr>
@@ -13704,15 +13677,7 @@
                 <w:sz w:val="18"/>
                 <w:szCs w:val="18"/>
               </w:rPr>
-              <w:t>3</w:t>
-            </w:r>
-            <w:r>
-              <w:rPr>
-                <w:rFonts w:eastAsia="Arial" w:cs="Arial"/>
-                <w:sz w:val="18"/>
-                <w:szCs w:val="18"/>
-              </w:rPr>
-              <w:t>/4 ✓</w:t>
+              <w:t>3/4 ✓</w:t>
             </w:r>
           </w:p>
         </w:tc>
@@ -16975,15 +16940,15 @@
         </w:tblCellMar>
       </w:tblPr>
       <w:tblGrid>
-        <w:gridCol w:w="2199"/>
-        <w:gridCol w:w="3001"/>
+        <w:gridCol w:w="2198"/>
+        <w:gridCol w:w="3002"/>
         <w:gridCol w:w="4160"/>
       </w:tblGrid>
       <w:tr>
         <w:trPr/>
         <w:tc>
           <w:tcPr>
-            <w:tcW w:w="2199" w:type="dxa"/>
+            <w:tcW w:w="2198" w:type="dxa"/>
             <w:tcBorders>
               <w:top w:val="single" w:sz="2" w:space="0" w:color="000000"/>
               <w:start w:val="single" w:sz="2" w:space="0" w:color="000000"/>
@@ -17013,7 +16978,7 @@
         </w:tc>
         <w:tc>
           <w:tcPr>
-            <w:tcW w:w="3001" w:type="dxa"/>
+            <w:tcW w:w="3002" w:type="dxa"/>
             <w:tcBorders>
               <w:top w:val="single" w:sz="2" w:space="0" w:color="000000"/>
               <w:start w:val="single" w:sz="2" w:space="0" w:color="000000"/>
@@ -17076,7 +17041,7 @@
         <w:trPr/>
         <w:tc>
           <w:tcPr>
-            <w:tcW w:w="2199" w:type="dxa"/>
+            <w:tcW w:w="2198" w:type="dxa"/>
             <w:tcBorders>
               <w:top w:val="single" w:sz="2" w:space="0" w:color="000000"/>
               <w:start w:val="single" w:sz="2" w:space="0" w:color="000000"/>
@@ -17103,7 +17068,7 @@
         </w:tc>
         <w:tc>
           <w:tcPr>
-            <w:tcW w:w="3001" w:type="dxa"/>
+            <w:tcW w:w="3002" w:type="dxa"/>
             <w:tcBorders>
               <w:top w:val="single" w:sz="2" w:space="0" w:color="000000"/>
               <w:start w:val="single" w:sz="2" w:space="0" w:color="000000"/>
@@ -17160,7 +17125,7 @@
         <w:trPr/>
         <w:tc>
           <w:tcPr>
-            <w:tcW w:w="2199" w:type="dxa"/>
+            <w:tcW w:w="2198" w:type="dxa"/>
             <w:tcBorders>
               <w:top w:val="single" w:sz="2" w:space="0" w:color="000000"/>
               <w:start w:val="single" w:sz="2" w:space="0" w:color="000000"/>
@@ -17187,7 +17152,7 @@
         </w:tc>
         <w:tc>
           <w:tcPr>
-            <w:tcW w:w="3001" w:type="dxa"/>
+            <w:tcW w:w="3002" w:type="dxa"/>
             <w:tcBorders>
               <w:top w:val="single" w:sz="2" w:space="0" w:color="000000"/>
               <w:start w:val="single" w:sz="2" w:space="0" w:color="000000"/>
@@ -17244,7 +17209,7 @@
         <w:trPr/>
         <w:tc>
           <w:tcPr>
-            <w:tcW w:w="2199" w:type="dxa"/>
+            <w:tcW w:w="2198" w:type="dxa"/>
             <w:tcBorders>
               <w:top w:val="single" w:sz="2" w:space="0" w:color="000000"/>
               <w:start w:val="single" w:sz="2" w:space="0" w:color="000000"/>
@@ -17271,7 +17236,7 @@
         </w:tc>
         <w:tc>
           <w:tcPr>
-            <w:tcW w:w="3001" w:type="dxa"/>
+            <w:tcW w:w="3002" w:type="dxa"/>
             <w:tcBorders>
               <w:top w:val="single" w:sz="2" w:space="0" w:color="000000"/>
               <w:start w:val="single" w:sz="2" w:space="0" w:color="000000"/>
@@ -17328,7 +17293,7 @@
         <w:trPr/>
         <w:tc>
           <w:tcPr>
-            <w:tcW w:w="2199" w:type="dxa"/>
+            <w:tcW w:w="2198" w:type="dxa"/>
             <w:tcBorders>
               <w:top w:val="single" w:sz="2" w:space="0" w:color="000000"/>
               <w:start w:val="single" w:sz="2" w:space="0" w:color="000000"/>
@@ -17355,7 +17320,7 @@
         </w:tc>
         <w:tc>
           <w:tcPr>
-            <w:tcW w:w="3001" w:type="dxa"/>
+            <w:tcW w:w="3002" w:type="dxa"/>
             <w:tcBorders>
               <w:top w:val="single" w:sz="2" w:space="0" w:color="000000"/>
               <w:start w:val="single" w:sz="2" w:space="0" w:color="000000"/>
@@ -17412,7 +17377,7 @@
         <w:trPr/>
         <w:tc>
           <w:tcPr>
-            <w:tcW w:w="2199" w:type="dxa"/>
+            <w:tcW w:w="2198" w:type="dxa"/>
             <w:tcBorders>
               <w:top w:val="single" w:sz="2" w:space="0" w:color="000000"/>
               <w:start w:val="single" w:sz="2" w:space="0" w:color="000000"/>
@@ -17439,7 +17404,7 @@
         </w:tc>
         <w:tc>
           <w:tcPr>
-            <w:tcW w:w="3001" w:type="dxa"/>
+            <w:tcW w:w="3002" w:type="dxa"/>
             <w:tcBorders>
               <w:top w:val="single" w:sz="2" w:space="0" w:color="000000"/>
               <w:start w:val="single" w:sz="2" w:space="0" w:color="000000"/>
@@ -17534,15 +17499,15 @@
         </w:tblCellMar>
       </w:tblPr>
       <w:tblGrid>
-        <w:gridCol w:w="2799"/>
-        <w:gridCol w:w="2201"/>
+        <w:gridCol w:w="2798"/>
+        <w:gridCol w:w="2202"/>
         <w:gridCol w:w="4360"/>
       </w:tblGrid>
       <w:tr>
         <w:trPr/>
         <w:tc>
           <w:tcPr>
-            <w:tcW w:w="2799" w:type="dxa"/>
+            <w:tcW w:w="2798" w:type="dxa"/>
             <w:tcBorders>
               <w:top w:val="single" w:sz="2" w:space="0" w:color="000000"/>
               <w:start w:val="single" w:sz="2" w:space="0" w:color="000000"/>
@@ -17572,7 +17537,7 @@
         </w:tc>
         <w:tc>
           <w:tcPr>
-            <w:tcW w:w="2201" w:type="dxa"/>
+            <w:tcW w:w="2202" w:type="dxa"/>
             <w:tcBorders>
               <w:top w:val="single" w:sz="2" w:space="0" w:color="000000"/>
               <w:start w:val="single" w:sz="2" w:space="0" w:color="000000"/>
@@ -17635,7 +17600,7 @@
         <w:trPr/>
         <w:tc>
           <w:tcPr>
-            <w:tcW w:w="2799" w:type="dxa"/>
+            <w:tcW w:w="2798" w:type="dxa"/>
             <w:tcBorders>
               <w:top w:val="single" w:sz="2" w:space="0" w:color="000000"/>
               <w:start w:val="single" w:sz="2" w:space="0" w:color="000000"/>
@@ -17662,7 +17627,7 @@
         </w:tc>
         <w:tc>
           <w:tcPr>
-            <w:tcW w:w="2201" w:type="dxa"/>
+            <w:tcW w:w="2202" w:type="dxa"/>
             <w:tcBorders>
               <w:top w:val="single" w:sz="2" w:space="0" w:color="000000"/>
               <w:start w:val="single" w:sz="2" w:space="0" w:color="000000"/>
@@ -17719,7 +17684,7 @@
         <w:trPr/>
         <w:tc>
           <w:tcPr>
-            <w:tcW w:w="2799" w:type="dxa"/>
+            <w:tcW w:w="2798" w:type="dxa"/>
             <w:tcBorders>
               <w:top w:val="single" w:sz="2" w:space="0" w:color="000000"/>
               <w:start w:val="single" w:sz="2" w:space="0" w:color="000000"/>
@@ -17746,7 +17711,7 @@
         </w:tc>
         <w:tc>
           <w:tcPr>
-            <w:tcW w:w="2201" w:type="dxa"/>
+            <w:tcW w:w="2202" w:type="dxa"/>
             <w:tcBorders>
               <w:top w:val="single" w:sz="2" w:space="0" w:color="000000"/>
               <w:start w:val="single" w:sz="2" w:space="0" w:color="000000"/>
@@ -17803,7 +17768,7 @@
         <w:trPr/>
         <w:tc>
           <w:tcPr>
-            <w:tcW w:w="2799" w:type="dxa"/>
+            <w:tcW w:w="2798" w:type="dxa"/>
             <w:tcBorders>
               <w:top w:val="single" w:sz="2" w:space="0" w:color="000000"/>
               <w:start w:val="single" w:sz="2" w:space="0" w:color="000000"/>
@@ -17830,7 +17795,7 @@
         </w:tc>
         <w:tc>
           <w:tcPr>
-            <w:tcW w:w="2201" w:type="dxa"/>
+            <w:tcW w:w="2202" w:type="dxa"/>
             <w:tcBorders>
               <w:top w:val="single" w:sz="2" w:space="0" w:color="000000"/>
               <w:start w:val="single" w:sz="2" w:space="0" w:color="000000"/>
@@ -17887,7 +17852,7 @@
         <w:trPr/>
         <w:tc>
           <w:tcPr>
-            <w:tcW w:w="2799" w:type="dxa"/>
+            <w:tcW w:w="2798" w:type="dxa"/>
             <w:tcBorders>
               <w:top w:val="single" w:sz="2" w:space="0" w:color="000000"/>
               <w:start w:val="single" w:sz="2" w:space="0" w:color="000000"/>
@@ -17914,7 +17879,7 @@
         </w:tc>
         <w:tc>
           <w:tcPr>
-            <w:tcW w:w="2201" w:type="dxa"/>
+            <w:tcW w:w="2202" w:type="dxa"/>
             <w:tcBorders>
               <w:top w:val="single" w:sz="2" w:space="0" w:color="000000"/>
               <w:start w:val="single" w:sz="2" w:space="0" w:color="000000"/>
@@ -17971,7 +17936,7 @@
         <w:trPr/>
         <w:tc>
           <w:tcPr>
-            <w:tcW w:w="2799" w:type="dxa"/>
+            <w:tcW w:w="2798" w:type="dxa"/>
             <w:tcBorders>
               <w:top w:val="single" w:sz="2" w:space="0" w:color="000000"/>
               <w:start w:val="single" w:sz="2" w:space="0" w:color="000000"/>
@@ -17998,7 +17963,7 @@
         </w:tc>
         <w:tc>
           <w:tcPr>
-            <w:tcW w:w="2201" w:type="dxa"/>
+            <w:tcW w:w="2202" w:type="dxa"/>
             <w:tcBorders>
               <w:top w:val="single" w:sz="2" w:space="0" w:color="000000"/>
               <w:start w:val="single" w:sz="2" w:space="0" w:color="000000"/>
@@ -18101,7 +18066,7 @@
         <w:pStyle w:val="ListParagraph"/>
         <w:numPr>
           <w:ilvl w:val="0"/>
-          <w:numId w:val="1"/>
+          <w:numId w:val="3"/>
         </w:numPr>
         <w:spacing w:before="0" w:after="40"/>
         <w:rPr/>
@@ -18120,7 +18085,7 @@
         <w:pStyle w:val="ListParagraph"/>
         <w:numPr>
           <w:ilvl w:val="0"/>
-          <w:numId w:val="1"/>
+          <w:numId w:val="3"/>
         </w:numPr>
         <w:spacing w:before="0" w:after="40"/>
         <w:rPr/>
@@ -18156,7 +18121,7 @@
         <w:pStyle w:val="ListParagraph"/>
         <w:numPr>
           <w:ilvl w:val="0"/>
-          <w:numId w:val="1"/>
+          <w:numId w:val="3"/>
         </w:numPr>
         <w:spacing w:before="0" w:after="40"/>
         <w:rPr/>
@@ -18175,7 +18140,7 @@
         <w:pStyle w:val="ListParagraph"/>
         <w:numPr>
           <w:ilvl w:val="0"/>
-          <w:numId w:val="1"/>
+          <w:numId w:val="3"/>
         </w:numPr>
         <w:spacing w:before="0" w:after="40"/>
         <w:rPr/>
@@ -18211,7 +18176,7 @@
         <w:pStyle w:val="ListParagraph"/>
         <w:numPr>
           <w:ilvl w:val="0"/>
-          <w:numId w:val="1"/>
+          <w:numId w:val="3"/>
         </w:numPr>
         <w:spacing w:before="0" w:after="40"/>
         <w:rPr/>
@@ -18230,7 +18195,7 @@
         <w:pStyle w:val="ListParagraph"/>
         <w:numPr>
           <w:ilvl w:val="0"/>
-          <w:numId w:val="1"/>
+          <w:numId w:val="3"/>
         </w:numPr>
         <w:spacing w:before="0" w:after="40"/>
         <w:rPr/>
@@ -18266,7 +18231,7 @@
         <w:pStyle w:val="ListParagraph"/>
         <w:numPr>
           <w:ilvl w:val="0"/>
-          <w:numId w:val="1"/>
+          <w:numId w:val="3"/>
         </w:numPr>
         <w:spacing w:before="0" w:after="40"/>
         <w:rPr/>
@@ -18285,7 +18250,7 @@
         <w:pStyle w:val="ListParagraph"/>
         <w:numPr>
           <w:ilvl w:val="0"/>
-          <w:numId w:val="1"/>
+          <w:numId w:val="3"/>
         </w:numPr>
         <w:spacing w:before="0" w:after="40"/>
         <w:rPr/>
@@ -18321,7 +18286,7 @@
         <w:pStyle w:val="ListParagraph"/>
         <w:numPr>
           <w:ilvl w:val="0"/>
-          <w:numId w:val="1"/>
+          <w:numId w:val="3"/>
         </w:numPr>
         <w:spacing w:before="0" w:after="40"/>
         <w:rPr/>
@@ -18359,16 +18324,16 @@
         </w:tblCellMar>
       </w:tblPr>
       <w:tblGrid>
-        <w:gridCol w:w="1799"/>
+        <w:gridCol w:w="1798"/>
         <w:gridCol w:w="2400"/>
-        <w:gridCol w:w="1561"/>
+        <w:gridCol w:w="1562"/>
         <w:gridCol w:w="3600"/>
       </w:tblGrid>
       <w:tr>
         <w:trPr/>
         <w:tc>
           <w:tcPr>
-            <w:tcW w:w="1799" w:type="dxa"/>
+            <w:tcW w:w="1798" w:type="dxa"/>
             <w:tcBorders>
               <w:top w:val="single" w:sz="2" w:space="0" w:color="000000"/>
               <w:start w:val="single" w:sz="2" w:space="0" w:color="000000"/>
@@ -18428,7 +18393,7 @@
         </w:tc>
         <w:tc>
           <w:tcPr>
-            <w:tcW w:w="1561" w:type="dxa"/>
+            <w:tcW w:w="1562" w:type="dxa"/>
             <w:tcBorders>
               <w:top w:val="single" w:sz="2" w:space="0" w:color="000000"/>
               <w:start w:val="single" w:sz="2" w:space="0" w:color="000000"/>
@@ -18491,7 +18456,7 @@
         <w:trPr/>
         <w:tc>
           <w:tcPr>
-            <w:tcW w:w="1799" w:type="dxa"/>
+            <w:tcW w:w="1798" w:type="dxa"/>
             <w:tcBorders>
               <w:top w:val="single" w:sz="2" w:space="0" w:color="000000"/>
               <w:start w:val="single" w:sz="2" w:space="0" w:color="000000"/>
@@ -18545,7 +18510,7 @@
         </w:tc>
         <w:tc>
           <w:tcPr>
-            <w:tcW w:w="1561" w:type="dxa"/>
+            <w:tcW w:w="1562" w:type="dxa"/>
             <w:tcBorders>
               <w:top w:val="single" w:sz="2" w:space="0" w:color="000000"/>
               <w:start w:val="single" w:sz="2" w:space="0" w:color="000000"/>
@@ -18602,7 +18567,7 @@
         <w:trPr/>
         <w:tc>
           <w:tcPr>
-            <w:tcW w:w="1799" w:type="dxa"/>
+            <w:tcW w:w="1798" w:type="dxa"/>
             <w:tcBorders>
               <w:top w:val="single" w:sz="2" w:space="0" w:color="000000"/>
               <w:start w:val="single" w:sz="2" w:space="0" w:color="000000"/>
@@ -18656,7 +18621,7 @@
         </w:tc>
         <w:tc>
           <w:tcPr>
-            <w:tcW w:w="1561" w:type="dxa"/>
+            <w:tcW w:w="1562" w:type="dxa"/>
             <w:tcBorders>
               <w:top w:val="single" w:sz="2" w:space="0" w:color="000000"/>
               <w:start w:val="single" w:sz="2" w:space="0" w:color="000000"/>
@@ -18713,7 +18678,7 @@
         <w:trPr/>
         <w:tc>
           <w:tcPr>
-            <w:tcW w:w="1799" w:type="dxa"/>
+            <w:tcW w:w="1798" w:type="dxa"/>
             <w:tcBorders>
               <w:top w:val="single" w:sz="2" w:space="0" w:color="000000"/>
               <w:start w:val="single" w:sz="2" w:space="0" w:color="000000"/>
@@ -18767,7 +18732,7 @@
         </w:tc>
         <w:tc>
           <w:tcPr>
-            <w:tcW w:w="1561" w:type="dxa"/>
+            <w:tcW w:w="1562" w:type="dxa"/>
             <w:tcBorders>
               <w:top w:val="single" w:sz="2" w:space="0" w:color="000000"/>
               <w:start w:val="single" w:sz="2" w:space="0" w:color="000000"/>
@@ -18824,7 +18789,7 @@
         <w:trPr/>
         <w:tc>
           <w:tcPr>
-            <w:tcW w:w="1799" w:type="dxa"/>
+            <w:tcW w:w="1798" w:type="dxa"/>
             <w:tcBorders>
               <w:top w:val="single" w:sz="2" w:space="0" w:color="000000"/>
               <w:start w:val="single" w:sz="2" w:space="0" w:color="000000"/>
@@ -18878,7 +18843,7 @@
         </w:tc>
         <w:tc>
           <w:tcPr>
-            <w:tcW w:w="1561" w:type="dxa"/>
+            <w:tcW w:w="1562" w:type="dxa"/>
             <w:tcBorders>
               <w:top w:val="single" w:sz="2" w:space="0" w:color="000000"/>
               <w:start w:val="single" w:sz="2" w:space="0" w:color="000000"/>
@@ -20807,7 +20772,13 @@
         </w:rPr>
       </w:pPr>
       <w:r>
-        <w:rPr/>
+        <w:rPr>
+          <w:rFonts w:eastAsia="Arial" w:cs="Arial"/>
+          <w:i/>
+          <w:iCs/>
+          <w:sz w:val="20"/>
+          <w:szCs w:val="20"/>
+        </w:rPr>
         <w:drawing>
           <wp:anchor distT="0" distB="0" distL="0" distR="0" simplePos="0" relativeHeight="37" behindDoc="0" locked="0" layoutInCell="0" allowOverlap="1">
             <wp:simplePos x="0" y="0"/>
@@ -21893,14 +21864,14 @@
         </w:tblCellMar>
       </w:tblPr>
       <w:tblGrid>
-        <w:gridCol w:w="3119"/>
-        <w:gridCol w:w="6241"/>
+        <w:gridCol w:w="3118"/>
+        <w:gridCol w:w="6242"/>
       </w:tblGrid>
       <w:tr>
         <w:trPr/>
         <w:tc>
           <w:tcPr>
-            <w:tcW w:w="3119" w:type="dxa"/>
+            <w:tcW w:w="3118" w:type="dxa"/>
             <w:tcBorders>
               <w:top w:val="single" w:sz="2" w:space="0" w:color="000000"/>
               <w:start w:val="single" w:sz="2" w:space="0" w:color="000000"/>
@@ -21930,7 +21901,7 @@
         </w:tc>
         <w:tc>
           <w:tcPr>
-            <w:tcW w:w="6241" w:type="dxa"/>
+            <w:tcW w:w="6242" w:type="dxa"/>
             <w:tcBorders>
               <w:top w:val="single" w:sz="2" w:space="0" w:color="000000"/>
               <w:start w:val="single" w:sz="2" w:space="0" w:color="000000"/>
@@ -21963,7 +21934,7 @@
         <w:trPr/>
         <w:tc>
           <w:tcPr>
-            <w:tcW w:w="3119" w:type="dxa"/>
+            <w:tcW w:w="3118" w:type="dxa"/>
             <w:tcBorders>
               <w:top w:val="single" w:sz="2" w:space="0" w:color="000000"/>
               <w:start w:val="single" w:sz="2" w:space="0" w:color="000000"/>
@@ -21990,7 +21961,7 @@
         </w:tc>
         <w:tc>
           <w:tcPr>
-            <w:tcW w:w="6241" w:type="dxa"/>
+            <w:tcW w:w="6242" w:type="dxa"/>
             <w:tcBorders>
               <w:top w:val="single" w:sz="2" w:space="0" w:color="000000"/>
               <w:start w:val="single" w:sz="2" w:space="0" w:color="000000"/>
@@ -22020,7 +21991,7 @@
         <w:trPr/>
         <w:tc>
           <w:tcPr>
-            <w:tcW w:w="3119" w:type="dxa"/>
+            <w:tcW w:w="3118" w:type="dxa"/>
             <w:tcBorders>
               <w:top w:val="single" w:sz="2" w:space="0" w:color="000000"/>
               <w:start w:val="single" w:sz="2" w:space="0" w:color="000000"/>
@@ -22047,7 +22018,7 @@
         </w:tc>
         <w:tc>
           <w:tcPr>
-            <w:tcW w:w="6241" w:type="dxa"/>
+            <w:tcW w:w="6242" w:type="dxa"/>
             <w:tcBorders>
               <w:top w:val="single" w:sz="2" w:space="0" w:color="000000"/>
               <w:start w:val="single" w:sz="2" w:space="0" w:color="000000"/>
@@ -22077,7 +22048,7 @@
         <w:trPr/>
         <w:tc>
           <w:tcPr>
-            <w:tcW w:w="3119" w:type="dxa"/>
+            <w:tcW w:w="3118" w:type="dxa"/>
             <w:tcBorders>
               <w:top w:val="single" w:sz="2" w:space="0" w:color="000000"/>
               <w:start w:val="single" w:sz="2" w:space="0" w:color="000000"/>
@@ -22104,7 +22075,7 @@
         </w:tc>
         <w:tc>
           <w:tcPr>
-            <w:tcW w:w="6241" w:type="dxa"/>
+            <w:tcW w:w="6242" w:type="dxa"/>
             <w:tcBorders>
               <w:top w:val="single" w:sz="2" w:space="0" w:color="000000"/>
               <w:start w:val="single" w:sz="2" w:space="0" w:color="000000"/>
@@ -22134,7 +22105,7 @@
         <w:trPr/>
         <w:tc>
           <w:tcPr>
-            <w:tcW w:w="3119" w:type="dxa"/>
+            <w:tcW w:w="3118" w:type="dxa"/>
             <w:tcBorders>
               <w:top w:val="single" w:sz="2" w:space="0" w:color="000000"/>
               <w:start w:val="single" w:sz="2" w:space="0" w:color="000000"/>
@@ -22161,7 +22132,7 @@
         </w:tc>
         <w:tc>
           <w:tcPr>
-            <w:tcW w:w="6241" w:type="dxa"/>
+            <w:tcW w:w="6242" w:type="dxa"/>
             <w:tcBorders>
               <w:top w:val="single" w:sz="2" w:space="0" w:color="000000"/>
               <w:start w:val="single" w:sz="2" w:space="0" w:color="000000"/>
@@ -22191,7 +22162,7 @@
         <w:trPr/>
         <w:tc>
           <w:tcPr>
-            <w:tcW w:w="3119" w:type="dxa"/>
+            <w:tcW w:w="3118" w:type="dxa"/>
             <w:tcBorders>
               <w:top w:val="single" w:sz="2" w:space="0" w:color="000000"/>
               <w:start w:val="single" w:sz="2" w:space="0" w:color="000000"/>
@@ -22218,7 +22189,7 @@
         </w:tc>
         <w:tc>
           <w:tcPr>
-            <w:tcW w:w="6241" w:type="dxa"/>
+            <w:tcW w:w="6242" w:type="dxa"/>
             <w:tcBorders>
               <w:top w:val="single" w:sz="2" w:space="0" w:color="000000"/>
               <w:start w:val="single" w:sz="2" w:space="0" w:color="000000"/>
@@ -22248,7 +22219,7 @@
         <w:trPr/>
         <w:tc>
           <w:tcPr>
-            <w:tcW w:w="3119" w:type="dxa"/>
+            <w:tcW w:w="3118" w:type="dxa"/>
             <w:tcBorders>
               <w:top w:val="single" w:sz="2" w:space="0" w:color="000000"/>
               <w:start w:val="single" w:sz="2" w:space="0" w:color="000000"/>
@@ -22275,7 +22246,7 @@
         </w:tc>
         <w:tc>
           <w:tcPr>
-            <w:tcW w:w="6241" w:type="dxa"/>
+            <w:tcW w:w="6242" w:type="dxa"/>
             <w:tcBorders>
               <w:top w:val="single" w:sz="2" w:space="0" w:color="000000"/>
               <w:start w:val="single" w:sz="2" w:space="0" w:color="000000"/>
@@ -22942,15 +22913,15 @@
         </w:tblCellMar>
       </w:tblPr>
       <w:tblGrid>
-        <w:gridCol w:w="2399"/>
-        <w:gridCol w:w="3201"/>
+        <w:gridCol w:w="2398"/>
+        <w:gridCol w:w="3202"/>
         <w:gridCol w:w="3760"/>
       </w:tblGrid>
       <w:tr>
         <w:trPr/>
         <w:tc>
           <w:tcPr>
-            <w:tcW w:w="2399" w:type="dxa"/>
+            <w:tcW w:w="2398" w:type="dxa"/>
             <w:tcBorders>
               <w:top w:val="single" w:sz="2" w:space="0" w:color="000000"/>
               <w:start w:val="single" w:sz="2" w:space="0" w:color="000000"/>
@@ -22980,7 +22951,7 @@
         </w:tc>
         <w:tc>
           <w:tcPr>
-            <w:tcW w:w="3201" w:type="dxa"/>
+            <w:tcW w:w="3202" w:type="dxa"/>
             <w:tcBorders>
               <w:top w:val="single" w:sz="2" w:space="0" w:color="000000"/>
               <w:start w:val="single" w:sz="2" w:space="0" w:color="000000"/>
@@ -23043,7 +23014,7 @@
         <w:trPr/>
         <w:tc>
           <w:tcPr>
-            <w:tcW w:w="2399" w:type="dxa"/>
+            <w:tcW w:w="2398" w:type="dxa"/>
             <w:tcBorders>
               <w:top w:val="single" w:sz="2" w:space="0" w:color="000000"/>
               <w:start w:val="single" w:sz="2" w:space="0" w:color="000000"/>
@@ -23070,7 +23041,7 @@
         </w:tc>
         <w:tc>
           <w:tcPr>
-            <w:tcW w:w="3201" w:type="dxa"/>
+            <w:tcW w:w="3202" w:type="dxa"/>
             <w:tcBorders>
               <w:top w:val="single" w:sz="2" w:space="0" w:color="000000"/>
               <w:start w:val="single" w:sz="2" w:space="0" w:color="000000"/>
@@ -23127,7 +23098,7 @@
         <w:trPr/>
         <w:tc>
           <w:tcPr>
-            <w:tcW w:w="2399" w:type="dxa"/>
+            <w:tcW w:w="2398" w:type="dxa"/>
             <w:tcBorders>
               <w:top w:val="single" w:sz="2" w:space="0" w:color="000000"/>
               <w:start w:val="single" w:sz="2" w:space="0" w:color="000000"/>
@@ -23154,7 +23125,7 @@
         </w:tc>
         <w:tc>
           <w:tcPr>
-            <w:tcW w:w="3201" w:type="dxa"/>
+            <w:tcW w:w="3202" w:type="dxa"/>
             <w:tcBorders>
               <w:top w:val="single" w:sz="2" w:space="0" w:color="000000"/>
               <w:start w:val="single" w:sz="2" w:space="0" w:color="000000"/>
@@ -23211,7 +23182,7 @@
         <w:trPr/>
         <w:tc>
           <w:tcPr>
-            <w:tcW w:w="2399" w:type="dxa"/>
+            <w:tcW w:w="2398" w:type="dxa"/>
             <w:tcBorders>
               <w:top w:val="single" w:sz="2" w:space="0" w:color="000000"/>
               <w:start w:val="single" w:sz="2" w:space="0" w:color="000000"/>
@@ -23238,7 +23209,7 @@
         </w:tc>
         <w:tc>
           <w:tcPr>
-            <w:tcW w:w="3201" w:type="dxa"/>
+            <w:tcW w:w="3202" w:type="dxa"/>
             <w:tcBorders>
               <w:top w:val="single" w:sz="2" w:space="0" w:color="000000"/>
               <w:start w:val="single" w:sz="2" w:space="0" w:color="000000"/>
@@ -23912,17 +23883,7 @@
           <w:sz w:val="22"/>
           <w:szCs w:val="22"/>
         </w:rPr>
-        <w:t>r</w:t>
-      </w:r>
-      <w:r>
-        <w:rPr>
-          <w:rFonts w:eastAsia="Arial" w:cs="Arial"/>
-          <w:b/>
-          <w:bCs/>
-          <w:sz w:val="22"/>
-          <w:szCs w:val="22"/>
-        </w:rPr>
-        <w:t>eprise du switch backup effectif.</w:t>
+        <w:t>reprise du switch backup effectif.</w:t>
       </w:r>
     </w:p>
     <w:p>
@@ -24581,16 +24542,16 @@
         </w:tblCellMar>
       </w:tblPr>
       <w:tblGrid>
-        <w:gridCol w:w="1799"/>
+        <w:gridCol w:w="1798"/>
         <w:gridCol w:w="2400"/>
-        <w:gridCol w:w="2581"/>
+        <w:gridCol w:w="2582"/>
         <w:gridCol w:w="2580"/>
       </w:tblGrid>
       <w:tr>
         <w:trPr/>
         <w:tc>
           <w:tcPr>
-            <w:tcW w:w="1799" w:type="dxa"/>
+            <w:tcW w:w="1798" w:type="dxa"/>
             <w:tcBorders>
               <w:top w:val="single" w:sz="2" w:space="0" w:color="000000"/>
               <w:start w:val="single" w:sz="2" w:space="0" w:color="000000"/>
@@ -24650,7 +24611,7 @@
         </w:tc>
         <w:tc>
           <w:tcPr>
-            <w:tcW w:w="2581" w:type="dxa"/>
+            <w:tcW w:w="2582" w:type="dxa"/>
             <w:tcBorders>
               <w:top w:val="single" w:sz="2" w:space="0" w:color="000000"/>
               <w:start w:val="single" w:sz="2" w:space="0" w:color="000000"/>
@@ -24713,7 +24674,7 @@
         <w:trPr/>
         <w:tc>
           <w:tcPr>
-            <w:tcW w:w="1799" w:type="dxa"/>
+            <w:tcW w:w="1798" w:type="dxa"/>
             <w:tcBorders>
               <w:top w:val="single" w:sz="2" w:space="0" w:color="000000"/>
               <w:start w:val="single" w:sz="2" w:space="0" w:color="000000"/>
@@ -24767,7 +24728,7 @@
         </w:tc>
         <w:tc>
           <w:tcPr>
-            <w:tcW w:w="2581" w:type="dxa"/>
+            <w:tcW w:w="2582" w:type="dxa"/>
             <w:tcBorders>
               <w:top w:val="single" w:sz="2" w:space="0" w:color="000000"/>
               <w:start w:val="single" w:sz="2" w:space="0" w:color="000000"/>
@@ -24824,7 +24785,7 @@
         <w:trPr/>
         <w:tc>
           <w:tcPr>
-            <w:tcW w:w="1799" w:type="dxa"/>
+            <w:tcW w:w="1798" w:type="dxa"/>
             <w:tcBorders>
               <w:top w:val="single" w:sz="2" w:space="0" w:color="000000"/>
               <w:start w:val="single" w:sz="2" w:space="0" w:color="000000"/>
@@ -24878,7 +24839,7 @@
         </w:tc>
         <w:tc>
           <w:tcPr>
-            <w:tcW w:w="2581" w:type="dxa"/>
+            <w:tcW w:w="2582" w:type="dxa"/>
             <w:tcBorders>
               <w:top w:val="single" w:sz="2" w:space="0" w:color="000000"/>
               <w:start w:val="single" w:sz="2" w:space="0" w:color="000000"/>
@@ -24935,7 +24896,7 @@
         <w:trPr/>
         <w:tc>
           <w:tcPr>
-            <w:tcW w:w="1799" w:type="dxa"/>
+            <w:tcW w:w="1798" w:type="dxa"/>
             <w:tcBorders>
               <w:top w:val="single" w:sz="2" w:space="0" w:color="000000"/>
               <w:start w:val="single" w:sz="2" w:space="0" w:color="000000"/>
@@ -24989,7 +24950,7 @@
         </w:tc>
         <w:tc>
           <w:tcPr>
-            <w:tcW w:w="2581" w:type="dxa"/>
+            <w:tcW w:w="2582" w:type="dxa"/>
             <w:tcBorders>
               <w:top w:val="single" w:sz="2" w:space="0" w:color="000000"/>
               <w:start w:val="single" w:sz="2" w:space="0" w:color="000000"/>
@@ -25046,7 +25007,7 @@
         <w:trPr/>
         <w:tc>
           <w:tcPr>
-            <w:tcW w:w="1799" w:type="dxa"/>
+            <w:tcW w:w="1798" w:type="dxa"/>
             <w:tcBorders>
               <w:top w:val="single" w:sz="2" w:space="0" w:color="000000"/>
               <w:start w:val="single" w:sz="2" w:space="0" w:color="000000"/>
@@ -25100,7 +25061,7 @@
         </w:tc>
         <w:tc>
           <w:tcPr>
-            <w:tcW w:w="2581" w:type="dxa"/>
+            <w:tcW w:w="2582" w:type="dxa"/>
             <w:tcBorders>
               <w:top w:val="single" w:sz="2" w:space="0" w:color="000000"/>
               <w:start w:val="single" w:sz="2" w:space="0" w:color="000000"/>
@@ -26119,15 +26080,15 @@
         </w:tblCellMar>
       </w:tblPr>
       <w:tblGrid>
-        <w:gridCol w:w="2399"/>
-        <w:gridCol w:w="3201"/>
+        <w:gridCol w:w="2398"/>
+        <w:gridCol w:w="3202"/>
         <w:gridCol w:w="3760"/>
       </w:tblGrid>
       <w:tr>
         <w:trPr/>
         <w:tc>
           <w:tcPr>
-            <w:tcW w:w="2399" w:type="dxa"/>
+            <w:tcW w:w="2398" w:type="dxa"/>
             <w:tcBorders>
               <w:top w:val="single" w:sz="2" w:space="0" w:color="000000"/>
               <w:start w:val="single" w:sz="2" w:space="0" w:color="000000"/>
@@ -26157,7 +26118,7 @@
         </w:tc>
         <w:tc>
           <w:tcPr>
-            <w:tcW w:w="3201" w:type="dxa"/>
+            <w:tcW w:w="3202" w:type="dxa"/>
             <w:tcBorders>
               <w:top w:val="single" w:sz="2" w:space="0" w:color="000000"/>
               <w:start w:val="single" w:sz="2" w:space="0" w:color="000000"/>
@@ -26220,7 +26181,7 @@
         <w:trPr/>
         <w:tc>
           <w:tcPr>
-            <w:tcW w:w="2399" w:type="dxa"/>
+            <w:tcW w:w="2398" w:type="dxa"/>
             <w:tcBorders>
               <w:top w:val="single" w:sz="2" w:space="0" w:color="000000"/>
               <w:start w:val="single" w:sz="2" w:space="0" w:color="000000"/>
@@ -26247,7 +26208,7 @@
         </w:tc>
         <w:tc>
           <w:tcPr>
-            <w:tcW w:w="3201" w:type="dxa"/>
+            <w:tcW w:w="3202" w:type="dxa"/>
             <w:tcBorders>
               <w:top w:val="single" w:sz="2" w:space="0" w:color="000000"/>
               <w:start w:val="single" w:sz="2" w:space="0" w:color="000000"/>
@@ -26304,7 +26265,7 @@
         <w:trPr/>
         <w:tc>
           <w:tcPr>
-            <w:tcW w:w="2399" w:type="dxa"/>
+            <w:tcW w:w="2398" w:type="dxa"/>
             <w:tcBorders>
               <w:top w:val="single" w:sz="2" w:space="0" w:color="000000"/>
               <w:start w:val="single" w:sz="2" w:space="0" w:color="000000"/>
@@ -26331,7 +26292,7 @@
         </w:tc>
         <w:tc>
           <w:tcPr>
-            <w:tcW w:w="3201" w:type="dxa"/>
+            <w:tcW w:w="3202" w:type="dxa"/>
             <w:tcBorders>
               <w:top w:val="single" w:sz="2" w:space="0" w:color="000000"/>
               <w:start w:val="single" w:sz="2" w:space="0" w:color="000000"/>
@@ -26388,7 +26349,7 @@
         <w:trPr/>
         <w:tc>
           <w:tcPr>
-            <w:tcW w:w="2399" w:type="dxa"/>
+            <w:tcW w:w="2398" w:type="dxa"/>
             <w:tcBorders>
               <w:top w:val="single" w:sz="2" w:space="0" w:color="000000"/>
               <w:start w:val="single" w:sz="2" w:space="0" w:color="000000"/>
@@ -26415,7 +26376,7 @@
         </w:tc>
         <w:tc>
           <w:tcPr>
-            <w:tcW w:w="3201" w:type="dxa"/>
+            <w:tcW w:w="3202" w:type="dxa"/>
             <w:tcBorders>
               <w:top w:val="single" w:sz="2" w:space="0" w:color="000000"/>
               <w:start w:val="single" w:sz="2" w:space="0" w:color="000000"/>
@@ -27486,6 +27447,7 @@
         </w:tabs>
         <w:ind w:start="1080" w:hanging="360"/>
       </w:pPr>
+      <w:rPr/>
     </w:lvl>
     <w:lvl w:ilvl="2">
       <w:start w:val="1"/>
@@ -27498,6 +27460,7 @@
         </w:tabs>
         <w:ind w:start="1440" w:hanging="360"/>
       </w:pPr>
+      <w:rPr/>
     </w:lvl>
     <w:lvl w:ilvl="3">
       <w:start w:val="1"/>
@@ -27510,6 +27473,7 @@
         </w:tabs>
         <w:ind w:start="1800" w:hanging="360"/>
       </w:pPr>
+      <w:rPr/>
     </w:lvl>
     <w:lvl w:ilvl="4">
       <w:start w:val="1"/>
@@ -27522,6 +27486,7 @@
         </w:tabs>
         <w:ind w:start="2160" w:hanging="360"/>
       </w:pPr>
+      <w:rPr/>
     </w:lvl>
     <w:lvl w:ilvl="5">
       <w:start w:val="1"/>
@@ -27534,6 +27499,7 @@
         </w:tabs>
         <w:ind w:start="2520" w:hanging="360"/>
       </w:pPr>
+      <w:rPr/>
     </w:lvl>
     <w:lvl w:ilvl="6">
       <w:start w:val="1"/>
@@ -27546,6 +27512,7 @@
         </w:tabs>
         <w:ind w:start="2880" w:hanging="360"/>
       </w:pPr>
+      <w:rPr/>
     </w:lvl>
     <w:lvl w:ilvl="7">
       <w:start w:val="1"/>
@@ -27558,6 +27525,7 @@
         </w:tabs>
         <w:ind w:start="3240" w:hanging="360"/>
       </w:pPr>
+      <w:rPr/>
     </w:lvl>
     <w:lvl w:ilvl="8">
       <w:start w:val="1"/>
@@ -27570,6 +27538,7 @@
         </w:tabs>
         <w:ind w:start="3600" w:hanging="360"/>
       </w:pPr>
+      <w:rPr/>
     </w:lvl>
   </w:abstractNum>
   <w:abstractNum w:abstractNumId="2">
@@ -27599,6 +27568,7 @@
         </w:tabs>
         <w:ind w:start="1080" w:hanging="360"/>
       </w:pPr>
+      <w:rPr/>
     </w:lvl>
     <w:lvl w:ilvl="2">
       <w:start w:val="1"/>
@@ -27611,6 +27581,7 @@
         </w:tabs>
         <w:ind w:start="1440" w:hanging="360"/>
       </w:pPr>
+      <w:rPr/>
     </w:lvl>
     <w:lvl w:ilvl="3">
       <w:start w:val="1"/>
@@ -27623,6 +27594,7 @@
         </w:tabs>
         <w:ind w:start="1800" w:hanging="360"/>
       </w:pPr>
+      <w:rPr/>
     </w:lvl>
     <w:lvl w:ilvl="4">
       <w:start w:val="1"/>
@@ -27635,6 +27607,7 @@
         </w:tabs>
         <w:ind w:start="2160" w:hanging="360"/>
       </w:pPr>
+      <w:rPr/>
     </w:lvl>
     <w:lvl w:ilvl="5">
       <w:start w:val="1"/>
@@ -27647,6 +27620,7 @@
         </w:tabs>
         <w:ind w:start="2520" w:hanging="360"/>
       </w:pPr>
+      <w:rPr/>
     </w:lvl>
     <w:lvl w:ilvl="6">
       <w:start w:val="1"/>
@@ -27659,6 +27633,7 @@
         </w:tabs>
         <w:ind w:start="2880" w:hanging="360"/>
       </w:pPr>
+      <w:rPr/>
     </w:lvl>
     <w:lvl w:ilvl="7">
       <w:start w:val="1"/>
@@ -27671,6 +27646,7 @@
         </w:tabs>
         <w:ind w:start="3240" w:hanging="360"/>
       </w:pPr>
+      <w:rPr/>
     </w:lvl>
     <w:lvl w:ilvl="8">
       <w:start w:val="1"/>
@@ -27683,9 +27659,252 @@
         </w:tabs>
         <w:ind w:start="3600" w:hanging="360"/>
       </w:pPr>
+      <w:rPr/>
     </w:lvl>
   </w:abstractNum>
   <w:abstractNum w:abstractNumId="3">
+    <w:lvl w:ilvl="0">
+      <w:start w:val="1"/>
+      <w:numFmt w:val="bullet"/>
+      <w:lvlText w:val=""/>
+      <w:lvlJc w:val="start"/>
+      <w:pPr>
+        <w:tabs>
+          <w:tab w:val="num" w:pos="0"/>
+        </w:tabs>
+        <w:ind w:start="720" w:hanging="360"/>
+      </w:pPr>
+      <w:rPr>
+        <w:rFonts w:ascii="Symbol" w:hAnsi="Symbol" w:cs="Symbol" w:hint="default"/>
+      </w:rPr>
+    </w:lvl>
+    <w:lvl w:ilvl="1">
+      <w:start w:val="1"/>
+      <w:numFmt w:val="decimal"/>
+      <w:lvlText w:val="%2."/>
+      <w:lvlJc w:val="start"/>
+      <w:pPr>
+        <w:tabs>
+          <w:tab w:val="num" w:pos="1080"/>
+        </w:tabs>
+        <w:ind w:start="1080" w:hanging="360"/>
+      </w:pPr>
+      <w:rPr/>
+    </w:lvl>
+    <w:lvl w:ilvl="2">
+      <w:start w:val="1"/>
+      <w:numFmt w:val="decimal"/>
+      <w:lvlText w:val="%3."/>
+      <w:lvlJc w:val="start"/>
+      <w:pPr>
+        <w:tabs>
+          <w:tab w:val="num" w:pos="1440"/>
+        </w:tabs>
+        <w:ind w:start="1440" w:hanging="360"/>
+      </w:pPr>
+      <w:rPr/>
+    </w:lvl>
+    <w:lvl w:ilvl="3">
+      <w:start w:val="1"/>
+      <w:numFmt w:val="decimal"/>
+      <w:lvlText w:val="%4."/>
+      <w:lvlJc w:val="start"/>
+      <w:pPr>
+        <w:tabs>
+          <w:tab w:val="num" w:pos="1800"/>
+        </w:tabs>
+        <w:ind w:start="1800" w:hanging="360"/>
+      </w:pPr>
+      <w:rPr/>
+    </w:lvl>
+    <w:lvl w:ilvl="4">
+      <w:start w:val="1"/>
+      <w:numFmt w:val="decimal"/>
+      <w:lvlText w:val="%5."/>
+      <w:lvlJc w:val="start"/>
+      <w:pPr>
+        <w:tabs>
+          <w:tab w:val="num" w:pos="2160"/>
+        </w:tabs>
+        <w:ind w:start="2160" w:hanging="360"/>
+      </w:pPr>
+      <w:rPr/>
+    </w:lvl>
+    <w:lvl w:ilvl="5">
+      <w:start w:val="1"/>
+      <w:numFmt w:val="decimal"/>
+      <w:lvlText w:val="%6."/>
+      <w:lvlJc w:val="start"/>
+      <w:pPr>
+        <w:tabs>
+          <w:tab w:val="num" w:pos="2520"/>
+        </w:tabs>
+        <w:ind w:start="2520" w:hanging="360"/>
+      </w:pPr>
+      <w:rPr/>
+    </w:lvl>
+    <w:lvl w:ilvl="6">
+      <w:start w:val="1"/>
+      <w:numFmt w:val="decimal"/>
+      <w:lvlText w:val="%7."/>
+      <w:lvlJc w:val="start"/>
+      <w:pPr>
+        <w:tabs>
+          <w:tab w:val="num" w:pos="2880"/>
+        </w:tabs>
+        <w:ind w:start="2880" w:hanging="360"/>
+      </w:pPr>
+      <w:rPr/>
+    </w:lvl>
+    <w:lvl w:ilvl="7">
+      <w:start w:val="1"/>
+      <w:numFmt w:val="decimal"/>
+      <w:lvlText w:val="%8."/>
+      <w:lvlJc w:val="start"/>
+      <w:pPr>
+        <w:tabs>
+          <w:tab w:val="num" w:pos="3240"/>
+        </w:tabs>
+        <w:ind w:start="3240" w:hanging="360"/>
+      </w:pPr>
+      <w:rPr/>
+    </w:lvl>
+    <w:lvl w:ilvl="8">
+      <w:start w:val="1"/>
+      <w:numFmt w:val="decimal"/>
+      <w:lvlText w:val="%9."/>
+      <w:lvlJc w:val="start"/>
+      <w:pPr>
+        <w:tabs>
+          <w:tab w:val="num" w:pos="3600"/>
+        </w:tabs>
+        <w:ind w:start="3600" w:hanging="360"/>
+      </w:pPr>
+      <w:rPr/>
+    </w:lvl>
+  </w:abstractNum>
+  <w:abstractNum w:abstractNumId="4">
+    <w:lvl w:ilvl="0">
+      <w:start w:val="1"/>
+      <w:numFmt w:val="bullet"/>
+      <w:lvlText w:val=""/>
+      <w:lvlJc w:val="start"/>
+      <w:pPr>
+        <w:tabs>
+          <w:tab w:val="num" w:pos="0"/>
+        </w:tabs>
+        <w:ind w:start="720" w:hanging="360"/>
+      </w:pPr>
+      <w:rPr>
+        <w:rFonts w:ascii="Symbol" w:hAnsi="Symbol" w:cs="Symbol" w:hint="default"/>
+      </w:rPr>
+    </w:lvl>
+    <w:lvl w:ilvl="1">
+      <w:start w:val="1"/>
+      <w:numFmt w:val="decimal"/>
+      <w:lvlText w:val="%2."/>
+      <w:lvlJc w:val="start"/>
+      <w:pPr>
+        <w:tabs>
+          <w:tab w:val="num" w:pos="1080"/>
+        </w:tabs>
+        <w:ind w:start="1080" w:hanging="360"/>
+      </w:pPr>
+      <w:rPr/>
+    </w:lvl>
+    <w:lvl w:ilvl="2">
+      <w:start w:val="1"/>
+      <w:numFmt w:val="decimal"/>
+      <w:lvlText w:val="%3."/>
+      <w:lvlJc w:val="start"/>
+      <w:pPr>
+        <w:tabs>
+          <w:tab w:val="num" w:pos="1440"/>
+        </w:tabs>
+        <w:ind w:start="1440" w:hanging="360"/>
+      </w:pPr>
+      <w:rPr/>
+    </w:lvl>
+    <w:lvl w:ilvl="3">
+      <w:start w:val="1"/>
+      <w:numFmt w:val="decimal"/>
+      <w:lvlText w:val="%4."/>
+      <w:lvlJc w:val="start"/>
+      <w:pPr>
+        <w:tabs>
+          <w:tab w:val="num" w:pos="1800"/>
+        </w:tabs>
+        <w:ind w:start="1800" w:hanging="360"/>
+      </w:pPr>
+      <w:rPr/>
+    </w:lvl>
+    <w:lvl w:ilvl="4">
+      <w:start w:val="1"/>
+      <w:numFmt w:val="decimal"/>
+      <w:lvlText w:val="%5."/>
+      <w:lvlJc w:val="start"/>
+      <w:pPr>
+        <w:tabs>
+          <w:tab w:val="num" w:pos="2160"/>
+        </w:tabs>
+        <w:ind w:start="2160" w:hanging="360"/>
+      </w:pPr>
+      <w:rPr/>
+    </w:lvl>
+    <w:lvl w:ilvl="5">
+      <w:start w:val="1"/>
+      <w:numFmt w:val="decimal"/>
+      <w:lvlText w:val="%6."/>
+      <w:lvlJc w:val="start"/>
+      <w:pPr>
+        <w:tabs>
+          <w:tab w:val="num" w:pos="2520"/>
+        </w:tabs>
+        <w:ind w:start="2520" w:hanging="360"/>
+      </w:pPr>
+      <w:rPr/>
+    </w:lvl>
+    <w:lvl w:ilvl="6">
+      <w:start w:val="1"/>
+      <w:numFmt w:val="decimal"/>
+      <w:lvlText w:val="%7."/>
+      <w:lvlJc w:val="start"/>
+      <w:pPr>
+        <w:tabs>
+          <w:tab w:val="num" w:pos="2880"/>
+        </w:tabs>
+        <w:ind w:start="2880" w:hanging="360"/>
+      </w:pPr>
+      <w:rPr/>
+    </w:lvl>
+    <w:lvl w:ilvl="7">
+      <w:start w:val="1"/>
+      <w:numFmt w:val="decimal"/>
+      <w:lvlText w:val="%8."/>
+      <w:lvlJc w:val="start"/>
+      <w:pPr>
+        <w:tabs>
+          <w:tab w:val="num" w:pos="3240"/>
+        </w:tabs>
+        <w:ind w:start="3240" w:hanging="360"/>
+      </w:pPr>
+      <w:rPr/>
+    </w:lvl>
+    <w:lvl w:ilvl="8">
+      <w:start w:val="1"/>
+      <w:numFmt w:val="decimal"/>
+      <w:lvlText w:val="%9."/>
+      <w:lvlJc w:val="start"/>
+      <w:pPr>
+        <w:tabs>
+          <w:tab w:val="num" w:pos="3600"/>
+        </w:tabs>
+        <w:ind w:start="3600" w:hanging="360"/>
+      </w:pPr>
+      <w:rPr/>
+    </w:lvl>
+  </w:abstractNum>
+  <w:abstractNum w:abstractNumId="5">
     <w:lvl w:ilvl="0">
       <w:start w:val="1"/>
       <w:numFmt w:val="none"/>
@@ -27814,13 +28033,19 @@
     <w:abstractNumId w:val="3"/>
   </w:num>
   <w:num w:numId="4">
-    <w:abstractNumId w:val="1"/>
+    <w:abstractNumId w:val="4"/>
+  </w:num>
+  <w:num w:numId="5">
+    <w:abstractNumId w:val="5"/>
+  </w:num>
+  <w:num w:numId="6">
+    <w:abstractNumId w:val="3"/>
     <w:lvlOverride w:ilvl="0">
       <w:startOverride w:val="1"/>
     </w:lvlOverride>
   </w:num>
-  <w:num w:numId="5">
-    <w:abstractNumId w:val="2"/>
+  <w:num w:numId="7">
+    <w:abstractNumId w:val="4"/>
     <w:lvlOverride w:ilvl="0">
       <w:startOverride w:val="1"/>
     </w:lvlOverride>
@@ -27848,6 +28073,7 @@
     <w:qFormat/>
     <w:pPr>
       <w:widowControl/>
+      <w:suppressAutoHyphens w:val="true"/>
       <w:bidi w:val="0"/>
       <w:spacing w:before="0" w:after="0"/>
       <w:jc w:val="start"/>
@@ -27863,7 +28089,7 @@
   </w:style>
   <w:style w:type="paragraph" w:styleId="Heading1">
     <w:name w:val="heading 1"/>
-    <w:basedOn w:val="Titre"/>
+    <w:basedOn w:val="Titreuser"/>
     <w:qFormat/>
     <w:pPr/>
     <w:rPr>
@@ -27874,7 +28100,7 @@
   </w:style>
   <w:style w:type="paragraph" w:styleId="Heading2">
     <w:name w:val="heading 2"/>
-    <w:basedOn w:val="Titre"/>
+    <w:basedOn w:val="Titreuser"/>
     <w:qFormat/>
     <w:pPr/>
     <w:rPr>
@@ -27885,7 +28111,7 @@
   </w:style>
   <w:style w:type="paragraph" w:styleId="Heading3">
     <w:name w:val="heading 3"/>
-    <w:basedOn w:val="Titre"/>
+    <w:basedOn w:val="Titreuser"/>
     <w:qFormat/>
     <w:pPr/>
     <w:rPr>
@@ -27896,7 +28122,7 @@
   </w:style>
   <w:style w:type="paragraph" w:styleId="Heading4">
     <w:name w:val="heading 4"/>
-    <w:basedOn w:val="Titre"/>
+    <w:basedOn w:val="Titreuser"/>
     <w:qFormat/>
     <w:pPr/>
     <w:rPr>
@@ -27907,7 +28133,7 @@
   </w:style>
   <w:style w:type="paragraph" w:styleId="Heading5">
     <w:name w:val="heading 5"/>
-    <w:basedOn w:val="Titre"/>
+    <w:basedOn w:val="Titreuser"/>
     <w:qFormat/>
     <w:pPr/>
     <w:rPr>
@@ -27916,7 +28142,7 @@
   </w:style>
   <w:style w:type="paragraph" w:styleId="Heading6">
     <w:name w:val="heading 6"/>
-    <w:basedOn w:val="Titre"/>
+    <w:basedOn w:val="Titreuser"/>
     <w:qFormat/>
     <w:pPr/>
     <w:rPr>
@@ -27932,11 +28158,18 @@
       <w:u w:val="single"/>
     </w:rPr>
   </w:style>
-  <w:style w:type="character" w:styleId="Caractresdenotedebasdepage">
-    <w:name w:val="Caractères de note de bas de page"/>
+  <w:style w:type="character" w:styleId="Caractresdenotedebasdepageuser">
+    <w:name w:val="Caractères de note de bas de page (user)"/>
     <w:uiPriority w:val="99"/>
     <w:semiHidden/>
     <w:unhideWhenUsed/>
+    <w:qFormat/>
+    <w:rPr>
+      <w:vertAlign w:val="superscript"/>
+    </w:rPr>
+  </w:style>
+  <w:style w:type="character" w:styleId="Caractresdenotedebasdepage">
+    <w:name w:val="Caractères de note de bas de page"/>
     <w:qFormat/>
     <w:rPr>
       <w:vertAlign w:val="superscript"/>
@@ -27959,11 +28192,18 @@
       <w:szCs w:val="20"/>
     </w:rPr>
   </w:style>
-  <w:style w:type="character" w:styleId="Caractresdenotedefin">
-    <w:name w:val="Caractères de note de fin"/>
+  <w:style w:type="character" w:styleId="Caractresdenotedefinuser">
+    <w:name w:val="Caractères de note de fin (user)"/>
     <w:uiPriority w:val="99"/>
     <w:semiHidden/>
     <w:unhideWhenUsed/>
+    <w:qFormat/>
+    <w:rPr>
+      <w:vertAlign w:val="superscript"/>
+    </w:rPr>
+  </w:style>
+  <w:style w:type="character" w:styleId="Caractresdenotedefin">
+    <w:name w:val="Caractères de note de fin"/>
     <w:qFormat/>
     <w:rPr>
       <w:vertAlign w:val="superscript"/>
@@ -28052,9 +28292,24 @@
       <w:rFonts w:cs="Arial"/>
     </w:rPr>
   </w:style>
+  <w:style w:type="paragraph" w:styleId="Titreuser">
+    <w:name w:val="Titre (user)"/>
+    <w:basedOn w:val="Normal"/>
+    <w:next w:val="BodyText"/>
+    <w:qFormat/>
+    <w:pPr>
+      <w:keepNext w:val="true"/>
+      <w:spacing w:before="240" w:after="120"/>
+    </w:pPr>
+    <w:rPr>
+      <w:rFonts w:ascii="Liberation Sans" w:hAnsi="Liberation Sans" w:eastAsia="Microsoft YaHei" w:cs="Arial"/>
+      <w:sz w:val="28"/>
+      <w:szCs w:val="28"/>
+    </w:rPr>
+  </w:style>
   <w:style w:type="paragraph" w:styleId="Title">
     <w:name w:val="Title"/>
-    <w:basedOn w:val="Titre"/>
+    <w:basedOn w:val="Titreuser"/>
     <w:qFormat/>
     <w:pPr/>
     <w:rPr>
@@ -28067,6 +28322,7 @@
     <w:qFormat/>
     <w:pPr>
       <w:widowControl/>
+      <w:suppressAutoHyphens w:val="true"/>
       <w:bidi w:val="0"/>
       <w:spacing w:before="0" w:after="0"/>
       <w:jc w:val="start"/>
@@ -28087,6 +28343,7 @@
     <w:qFormat/>
     <w:pPr>
       <w:widowControl/>
+      <w:suppressAutoHyphens w:val="true"/>
       <w:bidi w:val="0"/>
       <w:spacing w:before="0" w:after="0"/>
       <w:jc w:val="start"/>
@@ -28130,8 +28387,8 @@
       <w:szCs w:val="20"/>
     </w:rPr>
   </w:style>
-  <w:style w:type="paragraph" w:styleId="Lignehorizontale">
-    <w:name w:val="Ligne horizontale"/>
+  <w:style w:type="paragraph" w:styleId="Lignehorizontaleuser">
+    <w:name w:val="Ligne horizontale (user)"/>
     <w:basedOn w:val="Normal"/>
     <w:next w:val="BodyText"/>
     <w:qFormat/>

</xml_diff>